<commit_message>
UD1_P1_Avances Manual de Marcas
</commit_message>
<xml_diff>
--- a/UD1/P1/Act1_UD1_FrancellaRojas v2.docx
+++ b/UD1/P1/Act1_UD1_FrancellaRojas v2.docx
@@ -14,7 +14,7 @@
         <mc:AlternateContent>
           <mc:Choice Requires="wps">
             <w:drawing>
-              <wp:anchor distT="45720" distB="45720" distL="114300" distR="114300" simplePos="0" relativeHeight="251645952" behindDoc="0" locked="0" layoutInCell="1" allowOverlap="1" wp14:anchorId="3EFC96C9" wp14:editId="7B317FFF">
+              <wp:anchor distT="45720" distB="45720" distL="114300" distR="114300" simplePos="0" relativeHeight="251647488" behindDoc="0" locked="0" layoutInCell="1" allowOverlap="1" wp14:anchorId="3EFC96C9" wp14:editId="7B317FFF">
                 <wp:simplePos x="0" y="0"/>
                 <wp:positionH relativeFrom="margin">
                   <wp:posOffset>1052195</wp:posOffset>
@@ -104,7 +104,7 @@
                 <v:stroke joinstyle="miter"/>
                 <v:path gradientshapeok="t" o:connecttype="rect"/>
               </v:shapetype>
-              <v:shape id="Cuadro de texto 2" o:spid="_x0000_s1026" type="#_x0000_t202" style="position:absolute;margin-left:82.85pt;margin-top:232.15pt;width:280.5pt;height:121.5pt;z-index:251645952;visibility:visible;mso-wrap-style:square;mso-width-percent:0;mso-height-percent:0;mso-wrap-distance-left:9pt;mso-wrap-distance-top:3.6pt;mso-wrap-distance-right:9pt;mso-wrap-distance-bottom:3.6pt;mso-position-horizontal:absolute;mso-position-horizontal-relative:margin;mso-position-vertical:absolute;mso-position-vertical-relative:margin;mso-width-percent:0;mso-height-percent:0;mso-width-relative:margin;mso-height-relative:margin;v-text-anchor:top" o:gfxdata="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" filled="f" stroked="f">
+              <v:shape id="Cuadro de texto 2" o:spid="_x0000_s1026" type="#_x0000_t202" style="position:absolute;margin-left:82.85pt;margin-top:232.15pt;width:280.5pt;height:121.5pt;z-index:251647488;visibility:visible;mso-wrap-style:square;mso-width-percent:0;mso-height-percent:0;mso-wrap-distance-left:9pt;mso-wrap-distance-top:3.6pt;mso-wrap-distance-right:9pt;mso-wrap-distance-bottom:3.6pt;mso-position-horizontal:absolute;mso-position-horizontal-relative:margin;mso-position-vertical:absolute;mso-position-vertical-relative:margin;mso-width-percent:0;mso-height-percent:0;mso-width-relative:margin;mso-height-relative:margin;v-text-anchor:top" o:gfxdata="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" filled="f" stroked="f">
                 <v:textbox>
                   <w:txbxContent>
                     <w:p>
@@ -149,68 +149,7 @@
           <w:lang w:eastAsia="es-ES"/>
         </w:rPr>
         <w:drawing>
-          <wp:anchor distT="0" distB="0" distL="114300" distR="114300" simplePos="0" relativeHeight="251643904" behindDoc="0" locked="0" layoutInCell="1" allowOverlap="1" wp14:anchorId="4C4B09C6" wp14:editId="75C2C811">
-            <wp:simplePos x="0" y="0"/>
-            <wp:positionH relativeFrom="margin">
-              <wp:posOffset>-800100</wp:posOffset>
-            </wp:positionH>
-            <wp:positionV relativeFrom="margin">
-              <wp:posOffset>-190500</wp:posOffset>
-            </wp:positionV>
-            <wp:extent cx="1885315" cy="1028700"/>
-            <wp:effectExtent l="0" t="0" r="635" b="0"/>
-            <wp:wrapSquare wrapText="bothSides"/>
-            <wp:docPr id="13" name="Imagen 13"/>
-            <wp:cNvGraphicFramePr>
-              <a:graphicFrameLocks xmlns:a="http://schemas.openxmlformats.org/drawingml/2006/main" noChangeAspect="1"/>
-            </wp:cNvGraphicFramePr>
-            <a:graphic xmlns:a="http://schemas.openxmlformats.org/drawingml/2006/main">
-              <a:graphicData uri="http://schemas.openxmlformats.org/drawingml/2006/picture">
-                <pic:pic xmlns:pic="http://schemas.openxmlformats.org/drawingml/2006/picture">
-                  <pic:nvPicPr>
-                    <pic:cNvPr id="13" name="Gemini_Generated_Image_3638vy3638vy3638.jpg"/>
-                    <pic:cNvPicPr/>
-                  </pic:nvPicPr>
-                  <pic:blipFill>
-                    <a:blip r:embed="rId8" cstate="print">
-                      <a:extLst>
-                        <a:ext uri="{28A0092B-C50C-407E-A947-70E740481C1C}">
-                          <a14:useLocalDpi xmlns:a14="http://schemas.microsoft.com/office/drawing/2010/main" val="0"/>
-                        </a:ext>
-                      </a:extLst>
-                    </a:blip>
-                    <a:stretch>
-                      <a:fillRect/>
-                    </a:stretch>
-                  </pic:blipFill>
-                  <pic:spPr>
-                    <a:xfrm>
-                      <a:off x="0" y="0"/>
-                      <a:ext cx="1885315" cy="1028700"/>
-                    </a:xfrm>
-                    <a:prstGeom prst="rect">
-                      <a:avLst/>
-                    </a:prstGeom>
-                  </pic:spPr>
-                </pic:pic>
-              </a:graphicData>
-            </a:graphic>
-            <wp14:sizeRelH relativeFrom="margin">
-              <wp14:pctWidth>0</wp14:pctWidth>
-            </wp14:sizeRelH>
-            <wp14:sizeRelV relativeFrom="margin">
-              <wp14:pctHeight>0</wp14:pctHeight>
-            </wp14:sizeRelV>
-          </wp:anchor>
-        </w:drawing>
-      </w:r>
-      <w:r>
-        <w:rPr>
-          <w:noProof/>
-          <w:lang w:eastAsia="es-ES"/>
-        </w:rPr>
-        <w:drawing>
-          <wp:anchor distT="0" distB="0" distL="114300" distR="114300" simplePos="0" relativeHeight="251642880" behindDoc="0" locked="0" layoutInCell="1" allowOverlap="1" wp14:anchorId="4C823DE5" wp14:editId="3B8D4EA3">
+          <wp:anchor distT="0" distB="0" distL="114300" distR="114300" simplePos="0" relativeHeight="251645440" behindDoc="0" locked="0" layoutInCell="1" allowOverlap="1" wp14:anchorId="4C823DE5" wp14:editId="3B8D4EA3">
             <wp:simplePos x="0" y="0"/>
             <wp:positionH relativeFrom="margin">
               <wp:posOffset>-876300</wp:posOffset>
@@ -233,7 +172,7 @@
                     <pic:cNvPicPr/>
                   </pic:nvPicPr>
                   <pic:blipFill>
-                    <a:blip r:embed="rId9" cstate="print">
+                    <a:blip r:embed="rId8" cstate="print">
                       <a:extLst>
                         <a:ext uri="{28A0092B-C50C-407E-A947-70E740481C1C}">
                           <a14:useLocalDpi xmlns:a14="http://schemas.microsoft.com/office/drawing/2010/main" val="0"/>
@@ -265,7 +204,7 @@
           <w:lang w:eastAsia="es-ES"/>
         </w:rPr>
         <w:drawing>
-          <wp:anchor distT="0" distB="0" distL="114300" distR="114300" simplePos="0" relativeHeight="251641856" behindDoc="0" locked="0" layoutInCell="1" allowOverlap="1" wp14:anchorId="370E91E4" wp14:editId="44FFA707">
+          <wp:anchor distT="0" distB="0" distL="114300" distR="114300" simplePos="0" relativeHeight="251644416" behindDoc="0" locked="0" layoutInCell="1" allowOverlap="1" wp14:anchorId="370E91E4" wp14:editId="44FFA707">
             <wp:simplePos x="0" y="0"/>
             <wp:positionH relativeFrom="page">
               <wp:align>left</wp:align>
@@ -288,7 +227,7 @@
                     <pic:cNvPicPr/>
                   </pic:nvPicPr>
                   <pic:blipFill>
-                    <a:blip r:embed="rId10">
+                    <a:blip r:embed="rId9">
                       <a:extLst>
                         <a:ext uri="{28A0092B-C50C-407E-A947-70E740481C1C}">
                           <a14:useLocalDpi xmlns:a14="http://schemas.microsoft.com/office/drawing/2010/main" val="0"/>
@@ -375,14 +314,15 @@
           <w:r>
             <w:fldChar w:fldCharType="separate"/>
           </w:r>
-          <w:hyperlink w:anchor="_Toc240994404" w:history="1">
+          <w:hyperlink w:anchor="_Toc241167417" w:history="1">
             <w:r>
               <w:rPr>
                 <w:rStyle w:val="Hipervnculo"/>
                 <w:b/>
                 <w:noProof/>
+                <w:color w:val="023160" w:themeColor="hyperlink" w:themeShade="80"/>
               </w:rPr>
-              <w:t>Concepto de Empresa: NEBULA</w:t>
+              <w:t>Introducción:</w:t>
             </w:r>
             <w:r>
               <w:rPr>
@@ -403,7 +343,7 @@
                 <w:noProof/>
                 <w:webHidden/>
               </w:rPr>
-              <w:instrText xml:space="preserve"> PAGEREF _Toc240994404 \h </w:instrText>
+              <w:instrText xml:space="preserve"> PAGEREF _Toc241167417 \h </w:instrText>
             </w:r>
             <w:r>
               <w:rPr>
@@ -446,14 +386,14 @@
               <w:lang w:eastAsia="es-ES"/>
             </w:rPr>
           </w:pPr>
-          <w:hyperlink w:anchor="_Toc240994405" w:history="1">
+          <w:hyperlink w:anchor="_Toc241167418" w:history="1">
             <w:r>
               <w:rPr>
                 <w:rStyle w:val="Hipervnculo"/>
                 <w:b/>
                 <w:noProof/>
               </w:rPr>
-              <w:t>Dirección de Arte y Estética Visual</w:t>
+              <w:t>Concepto de Empresa: NEBULA</w:t>
             </w:r>
             <w:r>
               <w:rPr>
@@ -474,78 +414,7 @@
                 <w:noProof/>
                 <w:webHidden/>
               </w:rPr>
-              <w:instrText xml:space="preserve"> PAGEREF _Toc240994405 \h </w:instrText>
-            </w:r>
-            <w:r>
-              <w:rPr>
-                <w:noProof/>
-                <w:webHidden/>
-              </w:rPr>
-            </w:r>
-            <w:r>
-              <w:rPr>
-                <w:noProof/>
-                <w:webHidden/>
-              </w:rPr>
-              <w:fldChar w:fldCharType="separate"/>
-            </w:r>
-            <w:r>
-              <w:rPr>
-                <w:noProof/>
-                <w:webHidden/>
-              </w:rPr>
-              <w:t>3</w:t>
-            </w:r>
-            <w:r>
-              <w:rPr>
-                <w:noProof/>
-                <w:webHidden/>
-              </w:rPr>
-              <w:fldChar w:fldCharType="end"/>
-            </w:r>
-          </w:hyperlink>
-        </w:p>
-        <w:p>
-          <w:pPr>
-            <w:pStyle w:val="TDC1"/>
-            <w:tabs>
-              <w:tab w:val="right" w:leader="dot" w:pos="8494"/>
-            </w:tabs>
-            <w:rPr>
-              <w:rFonts w:eastAsiaTheme="minorEastAsia"/>
-              <w:noProof/>
-              <w:lang w:eastAsia="es-ES"/>
-            </w:rPr>
-          </w:pPr>
-          <w:hyperlink w:anchor="_Toc240994406" w:history="1">
-            <w:r>
-              <w:rPr>
-                <w:rStyle w:val="Hipervnculo"/>
-                <w:b/>
-                <w:noProof/>
-              </w:rPr>
-              <w:t>Variantes</w:t>
-            </w:r>
-            <w:r>
-              <w:rPr>
-                <w:noProof/>
-                <w:webHidden/>
-              </w:rPr>
-              <w:tab/>
-            </w:r>
-            <w:r>
-              <w:rPr>
-                <w:noProof/>
-                <w:webHidden/>
-              </w:rPr>
-              <w:fldChar w:fldCharType="begin"/>
-            </w:r>
-            <w:r>
-              <w:rPr>
-                <w:noProof/>
-                <w:webHidden/>
-              </w:rPr>
-              <w:instrText xml:space="preserve"> PAGEREF _Toc240994406 \h </w:instrText>
+              <w:instrText xml:space="preserve"> PAGEREF _Toc241167418 \h </w:instrText>
             </w:r>
             <w:r>
               <w:rPr>
@@ -588,14 +457,14 @@
               <w:lang w:eastAsia="es-ES"/>
             </w:rPr>
           </w:pPr>
-          <w:hyperlink w:anchor="_Toc240994407" w:history="1">
+          <w:hyperlink w:anchor="_Toc241167419" w:history="1">
             <w:r>
               <w:rPr>
                 <w:rStyle w:val="Hipervnculo"/>
                 <w:b/>
                 <w:noProof/>
               </w:rPr>
-              <w:t>Publicidad:</w:t>
+              <w:t>Dirección de Arte y Estética Visual</w:t>
             </w:r>
             <w:r>
               <w:rPr>
@@ -616,7 +485,78 @@
                 <w:noProof/>
                 <w:webHidden/>
               </w:rPr>
-              <w:instrText xml:space="preserve"> PAGEREF _Toc240994407 \h </w:instrText>
+              <w:instrText xml:space="preserve"> PAGEREF _Toc241167419 \h </w:instrText>
+            </w:r>
+            <w:r>
+              <w:rPr>
+                <w:noProof/>
+                <w:webHidden/>
+              </w:rPr>
+            </w:r>
+            <w:r>
+              <w:rPr>
+                <w:noProof/>
+                <w:webHidden/>
+              </w:rPr>
+              <w:fldChar w:fldCharType="separate"/>
+            </w:r>
+            <w:r>
+              <w:rPr>
+                <w:noProof/>
+                <w:webHidden/>
+              </w:rPr>
+              <w:t>4</w:t>
+            </w:r>
+            <w:r>
+              <w:rPr>
+                <w:noProof/>
+                <w:webHidden/>
+              </w:rPr>
+              <w:fldChar w:fldCharType="end"/>
+            </w:r>
+          </w:hyperlink>
+        </w:p>
+        <w:p>
+          <w:pPr>
+            <w:pStyle w:val="TDC1"/>
+            <w:tabs>
+              <w:tab w:val="right" w:leader="dot" w:pos="8494"/>
+            </w:tabs>
+            <w:rPr>
+              <w:rFonts w:eastAsiaTheme="minorEastAsia"/>
+              <w:noProof/>
+              <w:lang w:eastAsia="es-ES"/>
+            </w:rPr>
+          </w:pPr>
+          <w:hyperlink w:anchor="_Toc241167420" w:history="1">
+            <w:r>
+              <w:rPr>
+                <w:rStyle w:val="Hipervnculo"/>
+                <w:b/>
+                <w:noProof/>
+              </w:rPr>
+              <w:t>Variantes</w:t>
+            </w:r>
+            <w:r>
+              <w:rPr>
+                <w:noProof/>
+                <w:webHidden/>
+              </w:rPr>
+              <w:tab/>
+            </w:r>
+            <w:r>
+              <w:rPr>
+                <w:noProof/>
+                <w:webHidden/>
+              </w:rPr>
+              <w:fldChar w:fldCharType="begin"/>
+            </w:r>
+            <w:r>
+              <w:rPr>
+                <w:noProof/>
+                <w:webHidden/>
+              </w:rPr>
+              <w:instrText xml:space="preserve"> PAGEREF _Toc241167420 \h </w:instrText>
             </w:r>
             <w:r>
               <w:rPr>
@@ -659,14 +599,14 @@
               <w:lang w:eastAsia="es-ES"/>
             </w:rPr>
           </w:pPr>
-          <w:hyperlink w:anchor="_Toc240994408" w:history="1">
+          <w:hyperlink w:anchor="_Toc241167421" w:history="1">
             <w:r>
               <w:rPr>
                 <w:rStyle w:val="Hipervnculo"/>
                 <w:b/>
                 <w:noProof/>
               </w:rPr>
-              <w:t>Apartado de Colores:</w:t>
+              <w:t>Publicidad:</w:t>
             </w:r>
             <w:r>
               <w:rPr>
@@ -687,7 +627,7 @@
                 <w:noProof/>
                 <w:webHidden/>
               </w:rPr>
-              <w:instrText xml:space="preserve"> PAGEREF _Toc240994408 \h </w:instrText>
+              <w:instrText xml:space="preserve"> PAGEREF _Toc241167421 \h </w:instrText>
             </w:r>
             <w:r>
               <w:rPr>
@@ -720,22 +660,24 @@
         </w:p>
         <w:p>
           <w:pPr>
-            <w:pStyle w:val="TDC2"/>
+            <w:pStyle w:val="TDC1"/>
             <w:tabs>
               <w:tab w:val="right" w:leader="dot" w:pos="8494"/>
             </w:tabs>
             <w:rPr>
+              <w:rFonts w:eastAsiaTheme="minorEastAsia"/>
               <w:noProof/>
+              <w:lang w:eastAsia="es-ES"/>
             </w:rPr>
           </w:pPr>
-          <w:hyperlink w:anchor="_Toc240994409" w:history="1">
+          <w:hyperlink w:anchor="_Toc241167422" w:history="1">
             <w:r>
               <w:rPr>
                 <w:rStyle w:val="Hipervnculo"/>
                 <w:b/>
                 <w:noProof/>
               </w:rPr>
-              <w:t>PRIMARIOS:</w:t>
+              <w:t>Apartado de Colores:</w:t>
             </w:r>
             <w:r>
               <w:rPr>
@@ -756,76 +698,7 @@
                 <w:noProof/>
                 <w:webHidden/>
               </w:rPr>
-              <w:instrText xml:space="preserve"> PAGEREF _Toc240994409 \h </w:instrText>
-            </w:r>
-            <w:r>
-              <w:rPr>
-                <w:noProof/>
-                <w:webHidden/>
-              </w:rPr>
-            </w:r>
-            <w:r>
-              <w:rPr>
-                <w:noProof/>
-                <w:webHidden/>
-              </w:rPr>
-              <w:fldChar w:fldCharType="separate"/>
-            </w:r>
-            <w:r>
-              <w:rPr>
-                <w:noProof/>
-                <w:webHidden/>
-              </w:rPr>
-              <w:t>6</w:t>
-            </w:r>
-            <w:r>
-              <w:rPr>
-                <w:noProof/>
-                <w:webHidden/>
-              </w:rPr>
-              <w:fldChar w:fldCharType="end"/>
-            </w:r>
-          </w:hyperlink>
-        </w:p>
-        <w:p>
-          <w:pPr>
-            <w:pStyle w:val="TDC2"/>
-            <w:tabs>
-              <w:tab w:val="right" w:leader="dot" w:pos="8494"/>
-            </w:tabs>
-            <w:rPr>
-              <w:noProof/>
-            </w:rPr>
-          </w:pPr>
-          <w:hyperlink w:anchor="_Toc240994410" w:history="1">
-            <w:r>
-              <w:rPr>
-                <w:rStyle w:val="Hipervnculo"/>
-                <w:b/>
-                <w:noProof/>
-              </w:rPr>
-              <w:t>SECUNDARIOS:</w:t>
-            </w:r>
-            <w:r>
-              <w:rPr>
-                <w:noProof/>
-                <w:webHidden/>
-              </w:rPr>
-              <w:tab/>
-            </w:r>
-            <w:r>
-              <w:rPr>
-                <w:noProof/>
-                <w:webHidden/>
-              </w:rPr>
-              <w:fldChar w:fldCharType="begin"/>
-            </w:r>
-            <w:r>
-              <w:rPr>
-                <w:noProof/>
-                <w:webHidden/>
-              </w:rPr>
-              <w:instrText xml:space="preserve"> PAGEREF _Toc240994410 \h </w:instrText>
+              <w:instrText xml:space="preserve"> PAGEREF _Toc241167422 \h </w:instrText>
             </w:r>
             <w:r>
               <w:rPr>
@@ -863,17 +736,19 @@
               <w:tab w:val="right" w:leader="dot" w:pos="8494"/>
             </w:tabs>
             <w:rPr>
+              <w:rFonts w:eastAsiaTheme="minorEastAsia"/>
               <w:noProof/>
+              <w:lang w:eastAsia="es-ES"/>
             </w:rPr>
           </w:pPr>
-          <w:hyperlink w:anchor="_Toc240994411" w:history="1">
+          <w:hyperlink w:anchor="_Toc241167423" w:history="1">
             <w:r>
               <w:rPr>
                 <w:rStyle w:val="Hipervnculo"/>
                 <w:b/>
                 <w:noProof/>
               </w:rPr>
-              <w:t>COMPLEMENTARIOS:</w:t>
+              <w:t>PRIMARIOS:</w:t>
             </w:r>
             <w:r>
               <w:rPr>
@@ -894,7 +769,7 @@
                 <w:noProof/>
                 <w:webHidden/>
               </w:rPr>
-              <w:instrText xml:space="preserve"> PAGEREF _Toc240994411 \h </w:instrText>
+              <w:instrText xml:space="preserve"> PAGEREF _Toc241167423 \h </w:instrText>
             </w:r>
             <w:r>
               <w:rPr>
@@ -926,6 +801,148 @@
           </w:hyperlink>
         </w:p>
         <w:p>
+          <w:pPr>
+            <w:pStyle w:val="TDC2"/>
+            <w:tabs>
+              <w:tab w:val="right" w:leader="dot" w:pos="8494"/>
+            </w:tabs>
+            <w:rPr>
+              <w:rFonts w:eastAsiaTheme="minorEastAsia"/>
+              <w:noProof/>
+              <w:lang w:eastAsia="es-ES"/>
+            </w:rPr>
+          </w:pPr>
+          <w:hyperlink w:anchor="_Toc241167424" w:history="1">
+            <w:r>
+              <w:rPr>
+                <w:rStyle w:val="Hipervnculo"/>
+                <w:b/>
+                <w:noProof/>
+              </w:rPr>
+              <w:t>SECUNDARIOS:</w:t>
+            </w:r>
+            <w:r>
+              <w:rPr>
+                <w:noProof/>
+                <w:webHidden/>
+              </w:rPr>
+              <w:tab/>
+            </w:r>
+            <w:r>
+              <w:rPr>
+                <w:noProof/>
+                <w:webHidden/>
+              </w:rPr>
+              <w:fldChar w:fldCharType="begin"/>
+            </w:r>
+            <w:r>
+              <w:rPr>
+                <w:noProof/>
+                <w:webHidden/>
+              </w:rPr>
+              <w:instrText xml:space="preserve"> PAGEREF _Toc241167424 \h </w:instrText>
+            </w:r>
+            <w:r>
+              <w:rPr>
+                <w:noProof/>
+                <w:webHidden/>
+              </w:rPr>
+            </w:r>
+            <w:r>
+              <w:rPr>
+                <w:noProof/>
+                <w:webHidden/>
+              </w:rPr>
+              <w:fldChar w:fldCharType="separate"/>
+            </w:r>
+            <w:r>
+              <w:rPr>
+                <w:noProof/>
+                <w:webHidden/>
+              </w:rPr>
+              <w:t>8</w:t>
+            </w:r>
+            <w:r>
+              <w:rPr>
+                <w:noProof/>
+                <w:webHidden/>
+              </w:rPr>
+              <w:fldChar w:fldCharType="end"/>
+            </w:r>
+          </w:hyperlink>
+        </w:p>
+        <w:p>
+          <w:pPr>
+            <w:pStyle w:val="TDC2"/>
+            <w:tabs>
+              <w:tab w:val="right" w:leader="dot" w:pos="8494"/>
+            </w:tabs>
+            <w:rPr>
+              <w:rFonts w:eastAsiaTheme="minorEastAsia"/>
+              <w:noProof/>
+              <w:lang w:eastAsia="es-ES"/>
+            </w:rPr>
+          </w:pPr>
+          <w:hyperlink w:anchor="_Toc241167425" w:history="1">
+            <w:r>
+              <w:rPr>
+                <w:rStyle w:val="Hipervnculo"/>
+                <w:b/>
+                <w:noProof/>
+              </w:rPr>
+              <w:t>COMPLEMENTARIOS:</w:t>
+            </w:r>
+            <w:r>
+              <w:rPr>
+                <w:noProof/>
+                <w:webHidden/>
+              </w:rPr>
+              <w:tab/>
+            </w:r>
+            <w:r>
+              <w:rPr>
+                <w:noProof/>
+                <w:webHidden/>
+              </w:rPr>
+              <w:fldChar w:fldCharType="begin"/>
+            </w:r>
+            <w:r>
+              <w:rPr>
+                <w:noProof/>
+                <w:webHidden/>
+              </w:rPr>
+              <w:instrText xml:space="preserve"> PAGEREF _Toc241167425 \h </w:instrText>
+            </w:r>
+            <w:r>
+              <w:rPr>
+                <w:noProof/>
+                <w:webHidden/>
+              </w:rPr>
+            </w:r>
+            <w:r>
+              <w:rPr>
+                <w:noProof/>
+                <w:webHidden/>
+              </w:rPr>
+              <w:fldChar w:fldCharType="separate"/>
+            </w:r>
+            <w:r>
+              <w:rPr>
+                <w:noProof/>
+                <w:webHidden/>
+              </w:rPr>
+              <w:t>8</w:t>
+            </w:r>
+            <w:r>
+              <w:rPr>
+                <w:noProof/>
+                <w:webHidden/>
+              </w:rPr>
+              <w:fldChar w:fldCharType="end"/>
+            </w:r>
+          </w:hyperlink>
+        </w:p>
+        <w:p>
           <w:r>
             <w:rPr>
               <w:b/>
@@ -949,16 +966,319 @@
           <w:color w:val="5F0A95" w:themeColor="accent3" w:themeShade="80"/>
         </w:rPr>
       </w:pPr>
-      <w:bookmarkStart w:id="0" w:name="_Toc240994404"/>
+      <w:bookmarkStart w:id="0" w:name="_Toc241167417"/>
       <w:r>
         <w:rPr>
           <w:b/>
           <w:color w:val="5F0A95" w:themeColor="accent3" w:themeShade="80"/>
         </w:rPr>
         <w:lastRenderedPageBreak/>
+        <w:t>I</w:t>
+      </w:r>
+      <w:r>
+        <w:rPr>
+          <w:b/>
+          <w:color w:val="5F0A95" w:themeColor="accent3" w:themeShade="80"/>
+        </w:rPr>
+        <w:t>ntroducción</w:t>
+      </w:r>
+      <w:bookmarkEnd w:id="0"/>
+    </w:p>
+    <w:p>
+      <w:bookmarkStart w:id="1" w:name="_GoBack"/>
+      <w:bookmarkEnd w:id="1"/>
+    </w:p>
+    <w:p>
+      <w:pPr>
+        <w:jc w:val="both"/>
+        <w:rPr>
+          <w:rFonts w:asciiTheme="majorHAnsi" w:hAnsiTheme="majorHAnsi"/>
+          <w:sz w:val="24"/>
+          <w:szCs w:val="24"/>
+        </w:rPr>
+      </w:pPr>
+      <w:r>
+        <w:rPr>
+          <w:rFonts w:asciiTheme="majorHAnsi" w:hAnsiTheme="majorHAnsi"/>
+          <w:sz w:val="24"/>
+          <w:szCs w:val="24"/>
+        </w:rPr>
+        <w:t>BIENVENIDO A LAS DIRECTRICES DE MARCA DE NÉBULA</w:t>
+      </w:r>
+    </w:p>
+    <w:p>
+      <w:pPr>
+        <w:jc w:val="both"/>
+        <w:rPr>
+          <w:rFonts w:asciiTheme="majorHAnsi" w:hAnsiTheme="majorHAnsi"/>
+          <w:sz w:val="24"/>
+          <w:szCs w:val="24"/>
+        </w:rPr>
+      </w:pPr>
+      <w:r>
+        <w:rPr>
+          <w:rFonts w:asciiTheme="majorHAnsi" w:hAnsiTheme="majorHAnsi"/>
+          <w:i/>
+          <w:iCs/>
+          <w:sz w:val="24"/>
+          <w:szCs w:val="24"/>
+        </w:rPr>
+        <w:t>El cielo ha dejado de ser un límite: es nuestra infraestructura de vuelo.</w:t>
+      </w:r>
+    </w:p>
+    <w:p>
+      <w:pPr>
+        <w:jc w:val="both"/>
+        <w:rPr>
+          <w:rFonts w:asciiTheme="majorHAnsi" w:hAnsiTheme="majorHAnsi"/>
+          <w:sz w:val="24"/>
+          <w:szCs w:val="24"/>
+        </w:rPr>
+      </w:pPr>
+      <w:r>
+        <w:rPr>
+          <w:rFonts w:asciiTheme="majorHAnsi" w:hAnsiTheme="majorHAnsi"/>
+          <w:sz w:val="24"/>
+          <w:szCs w:val="24"/>
+        </w:rPr>
+        <w:t xml:space="preserve">En </w:t>
+      </w:r>
+      <w:r>
+        <w:rPr>
+          <w:rFonts w:asciiTheme="majorHAnsi" w:hAnsiTheme="majorHAnsi"/>
+          <w:b/>
+          <w:bCs/>
+          <w:sz w:val="24"/>
+          <w:szCs w:val="24"/>
+        </w:rPr>
+        <w:t>NÉBULA</w:t>
+      </w:r>
+      <w:r>
+        <w:rPr>
+          <w:rFonts w:asciiTheme="majorHAnsi" w:hAnsiTheme="majorHAnsi"/>
+          <w:sz w:val="24"/>
+          <w:szCs w:val="24"/>
+        </w:rPr>
+        <w:t xml:space="preserve"> estamos redefiniendo la movilidad urbana a través de vehículos aéreos autónomos y tecnología orbital de vanguardia. La coherencia absoluta en la ejecución de nuestra identidad visual no es solo una directriz estética: es el principio mediante el cual proyectamos precisión técnica, seguridad vehicular y la confianza necesaria para transformar el transporte del futuro.</w:t>
+      </w:r>
+    </w:p>
+    <w:p>
+      <w:pPr>
+        <w:jc w:val="both"/>
+        <w:rPr>
+          <w:rFonts w:asciiTheme="majorHAnsi" w:hAnsiTheme="majorHAnsi"/>
+          <w:sz w:val="24"/>
+          <w:szCs w:val="24"/>
+        </w:rPr>
+      </w:pPr>
+      <w:r>
+        <w:rPr>
+          <w:rFonts w:asciiTheme="majorHAnsi" w:hAnsiTheme="majorHAnsi"/>
+          <w:sz w:val="24"/>
+          <w:szCs w:val="24"/>
+        </w:rPr>
+        <w:t xml:space="preserve">Estas directrices han sido concebidas como una carta de navegación integral para todas las personas y equipos involucrados en el desarrollo de nuestras comunicaciones, interfaces de usuario y plataformas físicas o digitales. Cada decisión visual —desde el equilibrio de las trayectorias vectoriales de nuestro emblema hasta la tensión luminosa entre el </w:t>
+      </w:r>
+      <w:r>
+        <w:rPr>
+          <w:rFonts w:asciiTheme="majorHAnsi" w:hAnsiTheme="majorHAnsi"/>
+          <w:i/>
+          <w:iCs/>
+          <w:sz w:val="24"/>
+          <w:szCs w:val="24"/>
+        </w:rPr>
+        <w:t>Deep Space Black</w:t>
+      </w:r>
+      <w:r>
+        <w:rPr>
+          <w:rFonts w:asciiTheme="majorHAnsi" w:hAnsiTheme="majorHAnsi"/>
+          <w:sz w:val="24"/>
+          <w:szCs w:val="24"/>
+        </w:rPr>
+        <w:t xml:space="preserve"> y el </w:t>
+      </w:r>
+      <w:r>
+        <w:rPr>
+          <w:rFonts w:asciiTheme="majorHAnsi" w:hAnsiTheme="majorHAnsi"/>
+          <w:i/>
+          <w:iCs/>
+          <w:sz w:val="24"/>
+          <w:szCs w:val="24"/>
+        </w:rPr>
+        <w:t>Electric Cyan</w:t>
+      </w:r>
+      <w:r>
+        <w:rPr>
+          <w:rFonts w:asciiTheme="majorHAnsi" w:hAnsiTheme="majorHAnsi"/>
+          <w:sz w:val="24"/>
+          <w:szCs w:val="24"/>
+        </w:rPr>
+        <w:t>— responde a un propósito exacto: brindar solidez estructural y la serenidad que exige la navegación autónoma.</w:t>
+      </w:r>
+    </w:p>
+    <w:p>
+      <w:pPr>
+        <w:jc w:val="both"/>
+        <w:rPr>
+          <w:rFonts w:asciiTheme="majorHAnsi" w:hAnsiTheme="majorHAnsi"/>
+          <w:sz w:val="24"/>
+          <w:szCs w:val="24"/>
+        </w:rPr>
+      </w:pPr>
+      <w:r>
+        <w:rPr>
+          <w:rFonts w:asciiTheme="majorHAnsi" w:hAnsiTheme="majorHAnsi"/>
+          <w:sz w:val="24"/>
+          <w:szCs w:val="24"/>
+        </w:rPr>
+        <w:t>Te invitamos a leer, comprender y respetar los pilares que sustentan este documento:</w:t>
+      </w:r>
+    </w:p>
+    <w:p>
+      <w:pPr>
+        <w:jc w:val="both"/>
+        <w:rPr>
+          <w:rFonts w:asciiTheme="majorHAnsi" w:hAnsiTheme="majorHAnsi"/>
+          <w:sz w:val="24"/>
+          <w:szCs w:val="24"/>
+        </w:rPr>
+      </w:pPr>
+      <w:r>
+        <w:rPr>
+          <w:rFonts w:asciiTheme="majorHAnsi" w:hAnsiTheme="majorHAnsi"/>
+          <w:b/>
+          <w:bCs/>
+          <w:sz w:val="24"/>
+          <w:szCs w:val="24"/>
+        </w:rPr>
+        <w:t>Posicionamiento Estratégico:</w:t>
+      </w:r>
+      <w:r>
+        <w:rPr>
+          <w:rFonts w:asciiTheme="majorHAnsi" w:hAnsiTheme="majorHAnsi"/>
+          <w:sz w:val="24"/>
+          <w:szCs w:val="24"/>
+        </w:rPr>
+        <w:t xml:space="preserve"> Nuestra misión, anclada en la elegancia técnica, la autonomía y la vanguardia aeroespacial.</w:t>
+      </w:r>
+    </w:p>
+    <w:p>
+      <w:pPr>
+        <w:jc w:val="both"/>
+        <w:rPr>
+          <w:rFonts w:asciiTheme="majorHAnsi" w:hAnsiTheme="majorHAnsi"/>
+          <w:sz w:val="24"/>
+          <w:szCs w:val="24"/>
+        </w:rPr>
+      </w:pPr>
+      <w:r>
+        <w:rPr>
+          <w:rFonts w:asciiTheme="majorHAnsi" w:hAnsiTheme="majorHAnsi"/>
+          <w:b/>
+          <w:bCs/>
+          <w:sz w:val="24"/>
+          <w:szCs w:val="24"/>
+        </w:rPr>
+        <w:t>Arquitectura Visual &amp; Cromática:</w:t>
+      </w:r>
+      <w:r>
+        <w:rPr>
+          <w:rFonts w:asciiTheme="majorHAnsi" w:hAnsiTheme="majorHAnsi"/>
+          <w:sz w:val="24"/>
+          <w:szCs w:val="24"/>
+        </w:rPr>
+        <w:t xml:space="preserve"> Un sistema de alto contraste lumínico y armonías frías formulado para garantizar accesibilidad, serenidad y óptima legibilidad en cabina y entornos digitales.</w:t>
+      </w:r>
+    </w:p>
+    <w:p>
+      <w:pPr>
+        <w:jc w:val="both"/>
+        <w:rPr>
+          <w:rFonts w:asciiTheme="majorHAnsi" w:hAnsiTheme="majorHAnsi"/>
+          <w:sz w:val="24"/>
+          <w:szCs w:val="24"/>
+        </w:rPr>
+      </w:pPr>
+      <w:r>
+        <w:rPr>
+          <w:rFonts w:asciiTheme="majorHAnsi" w:hAnsiTheme="majorHAnsi"/>
+          <w:b/>
+          <w:bCs/>
+          <w:sz w:val="24"/>
+          <w:szCs w:val="24"/>
+        </w:rPr>
+        <w:t>Ecosistema de Aplicaciones:</w:t>
+      </w:r>
+      <w:r>
+        <w:rPr>
+          <w:rFonts w:asciiTheme="majorHAnsi" w:hAnsiTheme="majorHAnsi"/>
+          <w:sz w:val="24"/>
+          <w:szCs w:val="24"/>
+        </w:rPr>
+        <w:t xml:space="preserve"> Criterios de implementación a escala para soportes institucionales, campañas globales y diseño de interfaces interactivas (UI).</w:t>
+      </w:r>
+    </w:p>
+    <w:p>
+      <w:pPr>
+        <w:jc w:val="both"/>
+        <w:rPr>
+          <w:rFonts w:asciiTheme="majorHAnsi" w:hAnsiTheme="majorHAnsi"/>
+          <w:sz w:val="24"/>
+          <w:szCs w:val="24"/>
+        </w:rPr>
+      </w:pPr>
+      <w:r>
+        <w:rPr>
+          <w:rFonts w:asciiTheme="majorHAnsi" w:hAnsiTheme="majorHAnsi"/>
+          <w:sz w:val="24"/>
+          <w:szCs w:val="24"/>
+        </w:rPr>
+        <w:t>A medida que nuestra red de rutas continúe expandiéndose hacia nuevos horizontes, este manual evolucionará a la par de nuestros retos tecnológicos y de diseño.</w:t>
+      </w:r>
+    </w:p>
+    <w:p>
+      <w:pPr>
+        <w:jc w:val="both"/>
+        <w:rPr>
+          <w:rFonts w:asciiTheme="majorHAnsi" w:hAnsiTheme="majorHAnsi"/>
+          <w:sz w:val="24"/>
+          <w:szCs w:val="24"/>
+        </w:rPr>
+      </w:pPr>
+      <w:r>
+        <w:rPr>
+          <w:rFonts w:asciiTheme="majorHAnsi" w:hAnsiTheme="majorHAnsi"/>
+          <w:sz w:val="24"/>
+          <w:szCs w:val="24"/>
+        </w:rPr>
+        <w:t>Gracias por asumir el compromiso de priorizar nuestra marca y hacer despegar esta visión con el más alto estándar de excelencia.</w:t>
+      </w:r>
+    </w:p>
+    <w:p/>
+    <w:p/>
+    <w:p/>
+    <w:p/>
+    <w:p/>
+    <w:p/>
+    <w:p/>
+    <w:p>
+      <w:pPr>
+        <w:pStyle w:val="Ttulo1"/>
+        <w:rPr>
+          <w:b/>
+          <w:color w:val="5F0A95" w:themeColor="accent3" w:themeShade="80"/>
+        </w:rPr>
+      </w:pPr>
+      <w:bookmarkStart w:id="2" w:name="_Toc241167418"/>
+      <w:r>
+        <w:rPr>
+          <w:b/>
+          <w:color w:val="5F0A95" w:themeColor="accent3" w:themeShade="80"/>
+        </w:rPr>
+        <w:lastRenderedPageBreak/>
         <w:t>Concepto de Empresa: NEBULA</w:t>
       </w:r>
-      <w:bookmarkEnd w:id="0"/>
+      <w:bookmarkEnd w:id="2"/>
     </w:p>
     <w:p>
       <w:pPr>
@@ -1099,7 +1419,7 @@
           <w:color w:val="5F0A95" w:themeColor="accent3" w:themeShade="80"/>
         </w:rPr>
       </w:pPr>
-      <w:bookmarkStart w:id="1" w:name="_Toc240994405"/>
+      <w:bookmarkStart w:id="3" w:name="_Toc241167419"/>
       <w:r>
         <w:rPr>
           <w:b/>
@@ -1107,7 +1427,7 @@
         </w:rPr>
         <w:t>Dirección de Arte y Estética Visual</w:t>
       </w:r>
-      <w:bookmarkEnd w:id="1"/>
+      <w:bookmarkEnd w:id="3"/>
     </w:p>
     <w:p>
       <w:pPr>
@@ -1383,7 +1703,7 @@
           <w:noProof/>
         </w:rPr>
         <w:drawing>
-          <wp:anchor distT="0" distB="0" distL="114300" distR="114300" simplePos="0" relativeHeight="251646976" behindDoc="0" locked="0" layoutInCell="1" allowOverlap="1" wp14:anchorId="05E7E93A" wp14:editId="2CEAFCF6">
+          <wp:anchor distT="0" distB="0" distL="114300" distR="114300" simplePos="0" relativeHeight="251648512" behindDoc="0" locked="0" layoutInCell="1" allowOverlap="1" wp14:anchorId="4C3E0910" wp14:editId="02EE8A93">
             <wp:simplePos x="0" y="0"/>
             <wp:positionH relativeFrom="margin">
               <wp:posOffset>257175</wp:posOffset>
@@ -1406,7 +1726,7 @@
                     <pic:cNvPicPr/>
                   </pic:nvPicPr>
                   <pic:blipFill rotWithShape="1">
-                    <a:blip r:embed="rId11" cstate="print">
+                    <a:blip r:embed="rId10" cstate="print">
                       <a:extLst>
                         <a:ext uri="{28A0092B-C50C-407E-A947-70E740481C1C}">
                           <a14:useLocalDpi xmlns:a14="http://schemas.microsoft.com/office/drawing/2010/main" val="0"/>
@@ -1549,7 +1869,7 @@
           <w:color w:val="5F0A95" w:themeColor="accent3" w:themeShade="80"/>
         </w:rPr>
       </w:pPr>
-      <w:bookmarkStart w:id="2" w:name="_Toc240994406"/>
+      <w:bookmarkStart w:id="4" w:name="_Toc241167420"/>
       <w:r>
         <w:rPr>
           <w:b/>
@@ -1558,7 +1878,7 @@
         <w:lastRenderedPageBreak/>
         <w:t>Variantes</w:t>
       </w:r>
-      <w:bookmarkEnd w:id="2"/>
+      <w:bookmarkEnd w:id="4"/>
     </w:p>
     <w:p>
       <w:pPr>
@@ -1593,7 +1913,7 @@
           <w:noProof/>
         </w:rPr>
         <w:drawing>
-          <wp:inline distT="0" distB="0" distL="0" distR="0" wp14:anchorId="4DF72742" wp14:editId="1DA9EA2B">
+          <wp:inline distT="0" distB="0" distL="0" distR="0" wp14:anchorId="1446E220" wp14:editId="7E5DAC5B">
             <wp:extent cx="4314825" cy="897716"/>
             <wp:effectExtent l="0" t="0" r="0" b="0"/>
             <wp:docPr id="3" name="Imagen 3"/>
@@ -1608,7 +1928,7 @@
                     <pic:cNvPicPr/>
                   </pic:nvPicPr>
                   <pic:blipFill>
-                    <a:blip r:embed="rId9" cstate="print">
+                    <a:blip r:embed="rId8" cstate="print">
                       <a:extLst>
                         <a:ext uri="{28A0092B-C50C-407E-A947-70E740481C1C}">
                           <a14:useLocalDpi xmlns:a14="http://schemas.microsoft.com/office/drawing/2010/main" val="0"/>
@@ -1668,7 +1988,7 @@
           <w:noProof/>
         </w:rPr>
         <w:drawing>
-          <wp:anchor distT="0" distB="0" distL="114300" distR="114300" simplePos="0" relativeHeight="251639808" behindDoc="0" locked="0" layoutInCell="1" allowOverlap="1" wp14:anchorId="1A892946" wp14:editId="1B011802">
+          <wp:anchor distT="0" distB="0" distL="114300" distR="114300" simplePos="0" relativeHeight="251642368" behindDoc="0" locked="0" layoutInCell="1" allowOverlap="1" wp14:anchorId="6AAA21E2" wp14:editId="1BE2BAA3">
             <wp:simplePos x="0" y="0"/>
             <wp:positionH relativeFrom="margin">
               <wp:posOffset>882015</wp:posOffset>
@@ -1691,7 +2011,7 @@
                     <pic:cNvPicPr/>
                   </pic:nvPicPr>
                   <pic:blipFill rotWithShape="1">
-                    <a:blip r:embed="rId12" cstate="print">
+                    <a:blip r:embed="rId11" cstate="print">
                       <a:extLst>
                         <a:ext uri="{28A0092B-C50C-407E-A947-70E740481C1C}">
                           <a14:useLocalDpi xmlns:a14="http://schemas.microsoft.com/office/drawing/2010/main" val="0"/>
@@ -1840,7 +2160,7 @@
           <w:noProof/>
         </w:rPr>
         <w:drawing>
-          <wp:anchor distT="0" distB="0" distL="114300" distR="114300" simplePos="0" relativeHeight="251638784" behindDoc="0" locked="0" layoutInCell="1" allowOverlap="1" wp14:anchorId="1402B356" wp14:editId="46A69CF8">
+          <wp:anchor distT="0" distB="0" distL="114300" distR="114300" simplePos="0" relativeHeight="251641344" behindDoc="0" locked="0" layoutInCell="1" allowOverlap="1" wp14:anchorId="641EC964" wp14:editId="0C20FACA">
             <wp:simplePos x="0" y="0"/>
             <wp:positionH relativeFrom="margin">
               <wp:posOffset>1005840</wp:posOffset>
@@ -1863,7 +2183,7 @@
                     <pic:cNvPicPr/>
                   </pic:nvPicPr>
                   <pic:blipFill>
-                    <a:blip r:embed="rId13" cstate="print">
+                    <a:blip r:embed="rId12" cstate="print">
                       <a:extLst>
                         <a:ext uri="{28A0092B-C50C-407E-A947-70E740481C1C}">
                           <a14:useLocalDpi xmlns:a14="http://schemas.microsoft.com/office/drawing/2010/main" val="0"/>
@@ -1992,7 +2312,7 @@
           <w:lang w:eastAsia="es-ES"/>
         </w:rPr>
         <w:drawing>
-          <wp:anchor distT="0" distB="0" distL="114300" distR="114300" simplePos="0" relativeHeight="251640832" behindDoc="0" locked="0" layoutInCell="1" allowOverlap="1" wp14:anchorId="00E0AED0" wp14:editId="469F1770">
+          <wp:anchor distT="0" distB="0" distL="114300" distR="114300" simplePos="0" relativeHeight="251643392" behindDoc="0" locked="0" layoutInCell="1" allowOverlap="1" wp14:anchorId="6841DBB7" wp14:editId="4196EE7F">
             <wp:simplePos x="0" y="0"/>
             <wp:positionH relativeFrom="margin">
               <wp:posOffset>1302302</wp:posOffset>
@@ -2015,7 +2335,7 @@
                     <pic:cNvPicPr/>
                   </pic:nvPicPr>
                   <pic:blipFill>
-                    <a:blip r:embed="rId14" cstate="print">
+                    <a:blip r:embed="rId13" cstate="print">
                       <a:extLst>
                         <a:ext uri="{28A0092B-C50C-407E-A947-70E740481C1C}">
                           <a14:useLocalDpi xmlns:a14="http://schemas.microsoft.com/office/drawing/2010/main" val="0"/>
@@ -2067,7 +2387,7 @@
           <w:color w:val="5F0A95" w:themeColor="accent3" w:themeShade="80"/>
         </w:rPr>
       </w:pPr>
-      <w:bookmarkStart w:id="3" w:name="_Toc240994407"/>
+      <w:bookmarkStart w:id="5" w:name="_Toc241167421"/>
       <w:r>
         <w:rPr>
           <w:b/>
@@ -2075,7 +2395,7 @@
         </w:rPr>
         <w:t>Publicidad:</w:t>
       </w:r>
-      <w:bookmarkEnd w:id="3"/>
+      <w:bookmarkEnd w:id="5"/>
     </w:p>
     <w:p>
       <w:r>
@@ -2084,7 +2404,7 @@
           <w:lang w:eastAsia="es-ES"/>
         </w:rPr>
         <w:drawing>
-          <wp:inline distT="0" distB="0" distL="0" distR="0" wp14:anchorId="6052EE2A" wp14:editId="6887BBB0">
+          <wp:inline distT="0" distB="0" distL="0" distR="0" wp14:anchorId="56485102" wp14:editId="2F588F85">
             <wp:extent cx="5872348" cy="3277301"/>
             <wp:effectExtent l="0" t="0" r="0" b="0"/>
             <wp:docPr id="15" name="Imagen 15"/>
@@ -2099,7 +2419,7 @@
                     <pic:cNvPicPr/>
                   </pic:nvPicPr>
                   <pic:blipFill>
-                    <a:blip r:embed="rId15">
+                    <a:blip r:embed="rId14">
                       <a:extLst>
                         <a:ext uri="{28A0092B-C50C-407E-A947-70E740481C1C}">
                           <a14:useLocalDpi xmlns:a14="http://schemas.microsoft.com/office/drawing/2010/main" val="0"/>
@@ -2138,7 +2458,7 @@
           <w:color w:val="5F0A95" w:themeColor="accent3" w:themeShade="80"/>
         </w:rPr>
       </w:pPr>
-      <w:bookmarkStart w:id="4" w:name="_Toc240994408"/>
+      <w:bookmarkStart w:id="6" w:name="_Toc241167422"/>
       <w:r>
         <w:rPr>
           <w:b/>
@@ -2147,7 +2467,7 @@
         <w:lastRenderedPageBreak/>
         <w:t>Apartado de Colores:</w:t>
       </w:r>
-      <w:bookmarkEnd w:id="4"/>
+      <w:bookmarkEnd w:id="6"/>
     </w:p>
     <w:p>
       <w:r>
@@ -2192,25 +2512,7 @@
           <w:bCs/>
           <w:lang w:eastAsia="es-ES"/>
         </w:rPr>
-        <w:t xml:space="preserve">Justificación </w:t>
-      </w:r>
-      <w:r>
-        <w:rPr>
-          <w:rFonts w:asciiTheme="majorHAnsi" w:eastAsia="Times New Roman" w:hAnsiTheme="majorHAnsi" w:cstheme="majorHAnsi"/>
-          <w:b/>
-          <w:bCs/>
-          <w:lang w:eastAsia="es-ES"/>
-        </w:rPr>
-        <w:t>PPT</w:t>
-      </w:r>
-      <w:r>
-        <w:rPr>
-          <w:rFonts w:asciiTheme="majorHAnsi" w:eastAsia="Times New Roman" w:hAnsiTheme="majorHAnsi" w:cstheme="majorHAnsi"/>
-          <w:b/>
-          <w:bCs/>
-          <w:lang w:eastAsia="es-ES"/>
-        </w:rPr>
-        <w:t>:</w:t>
+        <w:t>Justificación PPT:</w:t>
       </w:r>
       <w:r>
         <w:rPr>
@@ -2310,25 +2612,7 @@
           <w:bCs/>
           <w:lang w:eastAsia="es-ES"/>
         </w:rPr>
-        <w:t xml:space="preserve">Justificación </w:t>
-      </w:r>
-      <w:r>
-        <w:rPr>
-          <w:rFonts w:asciiTheme="majorHAnsi" w:eastAsia="Times New Roman" w:hAnsiTheme="majorHAnsi" w:cstheme="majorHAnsi"/>
-          <w:b/>
-          <w:bCs/>
-          <w:lang w:eastAsia="es-ES"/>
-        </w:rPr>
-        <w:t>PPT</w:t>
-      </w:r>
-      <w:r>
-        <w:rPr>
-          <w:rFonts w:asciiTheme="majorHAnsi" w:eastAsia="Times New Roman" w:hAnsiTheme="majorHAnsi" w:cstheme="majorHAnsi"/>
-          <w:b/>
-          <w:bCs/>
-          <w:lang w:eastAsia="es-ES"/>
-        </w:rPr>
-        <w:t>:</w:t>
+        <w:t>Justificación PPT:</w:t>
       </w:r>
       <w:r>
         <w:rPr>
@@ -2597,7 +2881,7 @@
           <w:color w:val="000000" w:themeColor="text1"/>
         </w:rPr>
       </w:pPr>
-      <w:bookmarkStart w:id="5" w:name="_Toc240994409"/>
+      <w:bookmarkStart w:id="7" w:name="_Toc241167423"/>
       <w:r>
         <w:rPr>
           <w:b/>
@@ -2605,17 +2889,18 @@
         </w:rPr>
         <w:t>PRIMARIOS:</w:t>
       </w:r>
-      <w:bookmarkEnd w:id="5"/>
+      <w:bookmarkEnd w:id="7"/>
     </w:p>
     <w:p>
       <w:r>
         <w:rPr>
           <w:noProof/>
+          <w:lang w:eastAsia="es-ES"/>
         </w:rPr>
         <mc:AlternateContent>
           <mc:Choice Requires="wps">
             <w:drawing>
-              <wp:anchor distT="45720" distB="45720" distL="114300" distR="114300" simplePos="0" relativeHeight="251710464" behindDoc="0" locked="0" layoutInCell="1" allowOverlap="1" wp14:anchorId="3A38477F" wp14:editId="1C1BB6F2">
+              <wp:anchor distT="45720" distB="45720" distL="114300" distR="114300" simplePos="0" relativeHeight="251664896" behindDoc="0" locked="0" layoutInCell="1" allowOverlap="1" wp14:anchorId="7386BA54" wp14:editId="12A720A1">
                 <wp:simplePos x="0" y="0"/>
                 <wp:positionH relativeFrom="column">
                   <wp:posOffset>3673780</wp:posOffset>
@@ -2720,7 +3005,7 @@
           </mc:Choice>
           <mc:Fallback>
             <w:pict>
-              <v:shape w14:anchorId="3A38477F" id="_x0000_s1027" type="#_x0000_t202" style="position:absolute;margin-left:289.25pt;margin-top:22.95pt;width:59.75pt;height:53.75pt;z-index:251710464;visibility:visible;mso-wrap-style:square;mso-width-percent:0;mso-height-percent:0;mso-wrap-distance-left:9pt;mso-wrap-distance-top:3.6pt;mso-wrap-distance-right:9pt;mso-wrap-distance-bottom:3.6pt;mso-position-horizontal:absolute;mso-position-horizontal-relative:text;mso-position-vertical:absolute;mso-position-vertical-relative:text;mso-width-percent:0;mso-height-percent:0;mso-width-relative:margin;mso-height-relative:margin;v-text-anchor:top" o:gfxdata="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">
+              <v:shape w14:anchorId="7386BA54" id="_x0000_s1027" type="#_x0000_t202" style="position:absolute;margin-left:289.25pt;margin-top:22.95pt;width:59.75pt;height:53.75pt;z-index:251664896;visibility:visible;mso-wrap-style:square;mso-width-percent:0;mso-height-percent:0;mso-wrap-distance-left:9pt;mso-wrap-distance-top:3.6pt;mso-wrap-distance-right:9pt;mso-wrap-distance-bottom:3.6pt;mso-position-horizontal:absolute;mso-position-horizontal-relative:text;mso-position-vertical:absolute;mso-position-vertical-relative:text;mso-width-percent:0;mso-height-percent:0;mso-width-relative:margin;mso-height-relative:margin;v-text-anchor:top" o:gfxdata="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">
                 <v:textbox>
                   <w:txbxContent>
                     <w:p>
@@ -2777,11 +3062,12 @@
       <w:r>
         <w:rPr>
           <w:noProof/>
+          <w:lang w:eastAsia="es-ES"/>
         </w:rPr>
         <mc:AlternateContent>
           <mc:Choice Requires="wps">
             <w:drawing>
-              <wp:anchor distT="45720" distB="45720" distL="114300" distR="114300" simplePos="0" relativeHeight="251706368" behindDoc="0" locked="0" layoutInCell="1" allowOverlap="1" wp14:anchorId="6E46134A" wp14:editId="115EF2A0">
+              <wp:anchor distT="45720" distB="45720" distL="114300" distR="114300" simplePos="0" relativeHeight="251662848" behindDoc="0" locked="0" layoutInCell="1" allowOverlap="1" wp14:anchorId="309B7A8F" wp14:editId="57B99105">
                 <wp:simplePos x="0" y="0"/>
                 <wp:positionH relativeFrom="column">
                   <wp:posOffset>1915795</wp:posOffset>
@@ -2875,7 +3161,7 @@
           </mc:Choice>
           <mc:Fallback>
             <w:pict>
-              <v:shape w14:anchorId="6E46134A" id="_x0000_s1028" type="#_x0000_t202" style="position:absolute;margin-left:150.85pt;margin-top:22.9pt;width:59.75pt;height:53.75pt;z-index:251706368;visibility:visible;mso-wrap-style:square;mso-width-percent:0;mso-height-percent:0;mso-wrap-distance-left:9pt;mso-wrap-distance-top:3.6pt;mso-wrap-distance-right:9pt;mso-wrap-distance-bottom:3.6pt;mso-position-horizontal:absolute;mso-position-horizontal-relative:text;mso-position-vertical:absolute;mso-position-vertical-relative:text;mso-width-percent:0;mso-height-percent:0;mso-width-relative:margin;mso-height-relative:margin;v-text-anchor:top" o:gfxdata="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">
+              <v:shape w14:anchorId="309B7A8F" id="_x0000_s1028" type="#_x0000_t202" style="position:absolute;margin-left:150.85pt;margin-top:22.9pt;width:59.75pt;height:53.75pt;z-index:251662848;visibility:visible;mso-wrap-style:square;mso-width-percent:0;mso-height-percent:0;mso-wrap-distance-left:9pt;mso-wrap-distance-top:3.6pt;mso-wrap-distance-right:9pt;mso-wrap-distance-bottom:3.6pt;mso-position-horizontal:absolute;mso-position-horizontal-relative:text;mso-position-vertical:absolute;mso-position-vertical-relative:text;mso-width-percent:0;mso-height-percent:0;mso-width-relative:margin;mso-height-relative:margin;v-text-anchor:top" o:gfxdata="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">
                 <v:textbox>
                   <w:txbxContent>
                     <w:p>
@@ -2923,11 +3209,12 @@
       <w:r>
         <w:rPr>
           <w:noProof/>
+          <w:lang w:eastAsia="es-ES"/>
         </w:rPr>
         <mc:AlternateContent>
           <mc:Choice Requires="wps">
             <w:drawing>
-              <wp:anchor distT="45720" distB="45720" distL="114300" distR="114300" simplePos="0" relativeHeight="251704320" behindDoc="0" locked="0" layoutInCell="1" allowOverlap="1" wp14:anchorId="028E979B" wp14:editId="335AC09E">
+              <wp:anchor distT="45720" distB="45720" distL="114300" distR="114300" simplePos="0" relativeHeight="251661824" behindDoc="0" locked="0" layoutInCell="1" allowOverlap="1" wp14:anchorId="04FD5B31" wp14:editId="06A00946">
                 <wp:simplePos x="0" y="0"/>
                 <wp:positionH relativeFrom="column">
                   <wp:posOffset>995903</wp:posOffset>
@@ -3008,7 +3295,7 @@
           </mc:Choice>
           <mc:Fallback>
             <w:pict>
-              <v:shape w14:anchorId="028E979B" id="_x0000_s1029" type="#_x0000_t202" style="position:absolute;margin-left:78.4pt;margin-top:1.15pt;width:59.75pt;height:53.75pt;z-index:251704320;visibility:visible;mso-wrap-style:square;mso-width-percent:0;mso-height-percent:0;mso-wrap-distance-left:9pt;mso-wrap-distance-top:3.6pt;mso-wrap-distance-right:9pt;mso-wrap-distance-bottom:3.6pt;mso-position-horizontal:absolute;mso-position-horizontal-relative:text;mso-position-vertical:absolute;mso-position-vertical-relative:text;mso-width-percent:0;mso-height-percent:0;mso-width-relative:margin;mso-height-relative:margin;v-text-anchor:top" o:gfxdata="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">
+              <v:shape w14:anchorId="04FD5B31" id="_x0000_s1029" type="#_x0000_t202" style="position:absolute;margin-left:78.4pt;margin-top:1.15pt;width:59.75pt;height:53.75pt;z-index:251661824;visibility:visible;mso-wrap-style:square;mso-width-percent:0;mso-height-percent:0;mso-wrap-distance-left:9pt;mso-wrap-distance-top:3.6pt;mso-wrap-distance-right:9pt;mso-wrap-distance-bottom:3.6pt;mso-position-horizontal:absolute;mso-position-horizontal-relative:text;mso-position-vertical:absolute;mso-position-vertical-relative:text;mso-width-percent:0;mso-height-percent:0;mso-width-relative:margin;mso-height-relative:margin;v-text-anchor:top" o:gfxdata="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">
                 <v:textbox>
                   <w:txbxContent>
                     <w:p>
@@ -3041,11 +3328,12 @@
       <w:r>
         <w:rPr>
           <w:noProof/>
+          <w:lang w:eastAsia="es-ES"/>
         </w:rPr>
         <mc:AlternateContent>
           <mc:Choice Requires="wps">
             <w:drawing>
-              <wp:anchor distT="45720" distB="45720" distL="114300" distR="114300" simplePos="0" relativeHeight="251708416" behindDoc="0" locked="0" layoutInCell="1" allowOverlap="1" wp14:anchorId="3B9C46CA" wp14:editId="7554989C">
+              <wp:anchor distT="45720" distB="45720" distL="114300" distR="114300" simplePos="0" relativeHeight="251663872" behindDoc="0" locked="0" layoutInCell="1" allowOverlap="1" wp14:anchorId="449064D2" wp14:editId="7278B470">
                 <wp:simplePos x="0" y="0"/>
                 <wp:positionH relativeFrom="column">
                   <wp:posOffset>2783255</wp:posOffset>
@@ -3146,7 +3434,7 @@
           </mc:Choice>
           <mc:Fallback>
             <w:pict>
-              <v:shape w14:anchorId="3B9C46CA" id="_x0000_s1030" type="#_x0000_t202" style="position:absolute;margin-left:219.15pt;margin-top:.5pt;width:59.75pt;height:53.75pt;z-index:251708416;visibility:visible;mso-wrap-style:square;mso-width-percent:0;mso-height-percent:0;mso-wrap-distance-left:9pt;mso-wrap-distance-top:3.6pt;mso-wrap-distance-right:9pt;mso-wrap-distance-bottom:3.6pt;mso-position-horizontal:absolute;mso-position-horizontal-relative:text;mso-position-vertical:absolute;mso-position-vertical-relative:text;mso-width-percent:0;mso-height-percent:0;mso-width-relative:margin;mso-height-relative:margin;v-text-anchor:top" o:gfxdata="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">
+              <v:shape w14:anchorId="449064D2" id="_x0000_s1030" type="#_x0000_t202" style="position:absolute;margin-left:219.15pt;margin-top:.5pt;width:59.75pt;height:53.75pt;z-index:251663872;visibility:visible;mso-wrap-style:square;mso-width-percent:0;mso-height-percent:0;mso-wrap-distance-left:9pt;mso-wrap-distance-top:3.6pt;mso-wrap-distance-right:9pt;mso-wrap-distance-bottom:3.6pt;mso-position-horizontal:absolute;mso-position-horizontal-relative:text;mso-position-vertical:absolute;mso-position-vertical-relative:text;mso-width-percent:0;mso-height-percent:0;mso-width-relative:margin;mso-height-relative:margin;v-text-anchor:top" o:gfxdata="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">
                 <v:textbox>
                   <w:txbxContent>
                     <w:p>
@@ -3208,7 +3496,7 @@
         <mc:AlternateContent>
           <mc:Choice Requires="wps">
             <w:drawing>
-              <wp:anchor distT="0" distB="0" distL="114300" distR="114300" simplePos="0" relativeHeight="251685888" behindDoc="0" locked="0" layoutInCell="1" allowOverlap="1" wp14:anchorId="496F81B9" wp14:editId="55D06328">
+              <wp:anchor distT="0" distB="0" distL="114300" distR="114300" simplePos="0" relativeHeight="251649536" behindDoc="0" locked="0" layoutInCell="1" allowOverlap="1" wp14:anchorId="1BAF18F6" wp14:editId="275D5AFA">
                 <wp:simplePos x="0" y="0"/>
                 <wp:positionH relativeFrom="column">
                   <wp:posOffset>1025748</wp:posOffset>
@@ -3288,7 +3576,7 @@
         <mc:AlternateContent>
           <mc:Choice Requires="wps">
             <w:drawing>
-              <wp:anchor distT="0" distB="0" distL="114300" distR="114300" simplePos="0" relativeHeight="251686912" behindDoc="0" locked="0" layoutInCell="1" allowOverlap="1" wp14:anchorId="3678E447" wp14:editId="56DA3D1A">
+              <wp:anchor distT="0" distB="0" distL="114300" distR="114300" simplePos="0" relativeHeight="251650560" behindDoc="0" locked="0" layoutInCell="1" allowOverlap="1" wp14:anchorId="4377F8D8" wp14:editId="6C925001">
                 <wp:simplePos x="0" y="0"/>
                 <wp:positionH relativeFrom="column">
                   <wp:posOffset>1900332</wp:posOffset>
@@ -3368,7 +3656,7 @@
         <mc:AlternateContent>
           <mc:Choice Requires="wps">
             <w:drawing>
-              <wp:anchor distT="0" distB="0" distL="114300" distR="114300" simplePos="0" relativeHeight="251691008" behindDoc="0" locked="0" layoutInCell="1" allowOverlap="1" wp14:anchorId="0D66E8F6" wp14:editId="4003E907">
+              <wp:anchor distT="0" distB="0" distL="114300" distR="114300" simplePos="0" relativeHeight="251651584" behindDoc="0" locked="0" layoutInCell="1" allowOverlap="1" wp14:anchorId="441438E3" wp14:editId="56D7467D">
                 <wp:simplePos x="0" y="0"/>
                 <wp:positionH relativeFrom="column">
                   <wp:posOffset>2773408</wp:posOffset>
@@ -3448,7 +3736,7 @@
         <mc:AlternateContent>
           <mc:Choice Requires="wps">
             <w:drawing>
-              <wp:anchor distT="0" distB="0" distL="114300" distR="114300" simplePos="0" relativeHeight="251692032" behindDoc="0" locked="0" layoutInCell="1" allowOverlap="1" wp14:anchorId="710F8C34" wp14:editId="7C829ED9">
+              <wp:anchor distT="0" distB="0" distL="114300" distR="114300" simplePos="0" relativeHeight="251652608" behindDoc="0" locked="0" layoutInCell="1" allowOverlap="1" wp14:anchorId="1BB80413" wp14:editId="7D811E7F">
                 <wp:simplePos x="0" y="0"/>
                 <wp:positionH relativeFrom="column">
                   <wp:posOffset>3652182</wp:posOffset>
@@ -3532,7 +3820,7 @@
         <mc:AlternateContent>
           <mc:Choice Requires="wps">
             <w:drawing>
-              <wp:anchor distT="0" distB="0" distL="114300" distR="114300" simplePos="0" relativeHeight="251699200" behindDoc="0" locked="0" layoutInCell="1" allowOverlap="1" wp14:anchorId="3A14E3B1" wp14:editId="4E6FD6B1">
+              <wp:anchor distT="0" distB="0" distL="114300" distR="114300" simplePos="0" relativeHeight="251657728" behindDoc="0" locked="0" layoutInCell="1" allowOverlap="1" wp14:anchorId="5D7BE6EB" wp14:editId="7556BE14">
                 <wp:simplePos x="0" y="0"/>
                 <wp:positionH relativeFrom="column">
                   <wp:posOffset>1073150</wp:posOffset>
@@ -3687,7 +3975,7 @@
           </mc:Choice>
           <mc:Fallback>
             <w:pict>
-              <v:roundrect w14:anchorId="3A14E3B1" id="Rectángulo redondeado 27" o:spid="_x0000_s1031" style="position:absolute;margin-left:84.5pt;margin-top:12.95pt;width:50.45pt;height:89.7pt;z-index:251699200;visibility:visible;mso-wrap-style:square;mso-height-percent:0;mso-wrap-distance-left:9pt;mso-wrap-distance-top:0;mso-wrap-distance-right:9pt;mso-wrap-distance-bottom:0;mso-position-horizontal:absolute;mso-position-horizontal-relative:text;mso-position-vertical:absolute;mso-position-vertical-relative:text;mso-height-percent:0;mso-height-relative:margin;v-text-anchor:middle" arcsize="10923f" o:gfxdata="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" fillcolor="#f3f4f6 [3209]" strokecolor="#68738b [1609]" strokeweight="1pt">
+              <v:roundrect w14:anchorId="5D7BE6EB" id="Rectángulo redondeado 27" o:spid="_x0000_s1031" style="position:absolute;margin-left:84.5pt;margin-top:12.95pt;width:50.45pt;height:89.7pt;z-index:251657728;visibility:visible;mso-wrap-style:square;mso-height-percent:0;mso-wrap-distance-left:9pt;mso-wrap-distance-top:0;mso-wrap-distance-right:9pt;mso-wrap-distance-bottom:0;mso-position-horizontal:absolute;mso-position-horizontal-relative:text;mso-position-vertical:absolute;mso-position-vertical-relative:text;mso-height-percent:0;mso-height-relative:margin;v-text-anchor:middle" arcsize="10923f" o:gfxdata="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" fillcolor="#f3f4f6 [3209]" strokecolor="#68738b [1609]" strokeweight="1pt">
                 <v:fill opacity="47288f"/>
                 <v:stroke joinstyle="miter"/>
                 <v:textbox>
@@ -3794,7 +4082,7 @@
         <mc:AlternateContent>
           <mc:Choice Requires="wps">
             <w:drawing>
-              <wp:anchor distT="0" distB="0" distL="114300" distR="114300" simplePos="0" relativeHeight="251694080" behindDoc="0" locked="0" layoutInCell="1" allowOverlap="1" wp14:anchorId="338C1287" wp14:editId="1FAF90CC">
+              <wp:anchor distT="0" distB="0" distL="114300" distR="114300" simplePos="0" relativeHeight="251653632" behindDoc="0" locked="0" layoutInCell="1" allowOverlap="1" wp14:anchorId="1BC6F702" wp14:editId="3AFED760">
                 <wp:simplePos x="0" y="0"/>
                 <wp:positionH relativeFrom="column">
                   <wp:posOffset>1026383</wp:posOffset>
@@ -3863,7 +4151,7 @@
         <mc:AlternateContent>
           <mc:Choice Requires="wps">
             <w:drawing>
-              <wp:anchor distT="0" distB="0" distL="114300" distR="114300" simplePos="0" relativeHeight="251695104" behindDoc="0" locked="0" layoutInCell="1" allowOverlap="1" wp14:anchorId="2D52AE17" wp14:editId="57ED62E0">
+              <wp:anchor distT="0" distB="0" distL="114300" distR="114300" simplePos="0" relativeHeight="251654656" behindDoc="0" locked="0" layoutInCell="1" allowOverlap="1" wp14:anchorId="5D995AEF" wp14:editId="5F427397">
                 <wp:simplePos x="0" y="0"/>
                 <wp:positionH relativeFrom="column">
                   <wp:posOffset>1906509</wp:posOffset>
@@ -3932,7 +4220,7 @@
         <mc:AlternateContent>
           <mc:Choice Requires="wps">
             <w:drawing>
-              <wp:anchor distT="0" distB="0" distL="114300" distR="114300" simplePos="0" relativeHeight="251696128" behindDoc="0" locked="0" layoutInCell="1" allowOverlap="1" wp14:anchorId="48F6FFE5" wp14:editId="46C3C9D6">
+              <wp:anchor distT="0" distB="0" distL="114300" distR="114300" simplePos="0" relativeHeight="251655680" behindDoc="0" locked="0" layoutInCell="1" allowOverlap="1" wp14:anchorId="13594FDC" wp14:editId="645962E4">
                 <wp:simplePos x="0" y="0"/>
                 <wp:positionH relativeFrom="column">
                   <wp:posOffset>2773408</wp:posOffset>
@@ -4001,7 +4289,7 @@
         <mc:AlternateContent>
           <mc:Choice Requires="wps">
             <w:drawing>
-              <wp:anchor distT="0" distB="0" distL="114300" distR="114300" simplePos="0" relativeHeight="251697152" behindDoc="0" locked="0" layoutInCell="1" allowOverlap="1" wp14:anchorId="6022E1D2" wp14:editId="353E0F47">
+              <wp:anchor distT="0" distB="0" distL="114300" distR="114300" simplePos="0" relativeHeight="251656704" behindDoc="0" locked="0" layoutInCell="1" allowOverlap="1" wp14:anchorId="5433B8F7" wp14:editId="5F4BCA66">
                 <wp:simplePos x="0" y="0"/>
                 <wp:positionH relativeFrom="column">
                   <wp:posOffset>3652182</wp:posOffset>
@@ -4070,7 +4358,7 @@
         <mc:AlternateContent>
           <mc:Choice Requires="wps">
             <w:drawing>
-              <wp:anchor distT="0" distB="0" distL="114300" distR="114300" simplePos="0" relativeHeight="251701248" behindDoc="0" locked="0" layoutInCell="1" allowOverlap="1" wp14:anchorId="28DCF667" wp14:editId="3FE59E91">
+              <wp:anchor distT="0" distB="0" distL="114300" distR="114300" simplePos="0" relativeHeight="251658752" behindDoc="0" locked="0" layoutInCell="1" allowOverlap="1" wp14:anchorId="79A08FC1" wp14:editId="1FB7E41D">
                 <wp:simplePos x="0" y="0"/>
                 <wp:positionH relativeFrom="column">
                   <wp:posOffset>1959948</wp:posOffset>
@@ -4200,7 +4488,7 @@
           </mc:Choice>
           <mc:Fallback>
             <w:pict>
-              <v:roundrect w14:anchorId="28DCF667" id="Rectángulo redondeado 29" o:spid="_x0000_s1032" style="position:absolute;margin-left:154.35pt;margin-top:12.6pt;width:50.5pt;height:91.65pt;z-index:251701248;visibility:visible;mso-wrap-style:square;mso-wrap-distance-left:9pt;mso-wrap-distance-top:0;mso-wrap-distance-right:9pt;mso-wrap-distance-bottom:0;mso-position-horizontal:absolute;mso-position-horizontal-relative:text;mso-position-vertical:absolute;mso-position-vertical-relative:text;v-text-anchor:middle" arcsize="10923f" o:gfxdata="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" fillcolor="#f3f4f6 [3209]" strokecolor="#68738b [1609]" strokeweight="1pt">
+              <v:roundrect w14:anchorId="79A08FC1" id="Rectángulo redondeado 29" o:spid="_x0000_s1032" style="position:absolute;margin-left:154.35pt;margin-top:12.6pt;width:50.5pt;height:91.65pt;z-index:251658752;visibility:visible;mso-wrap-style:square;mso-wrap-distance-left:9pt;mso-wrap-distance-top:0;mso-wrap-distance-right:9pt;mso-wrap-distance-bottom:0;mso-position-horizontal:absolute;mso-position-horizontal-relative:text;mso-position-vertical:absolute;mso-position-vertical-relative:text;v-text-anchor:middle" arcsize="10923f" o:gfxdata="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" fillcolor="#f3f4f6 [3209]" strokecolor="#68738b [1609]" strokeweight="1pt">
                 <v:fill opacity="47288f"/>
                 <v:stroke joinstyle="miter"/>
                 <v:textbox>
@@ -4285,7 +4573,7 @@
         <mc:AlternateContent>
           <mc:Choice Requires="wps">
             <w:drawing>
-              <wp:anchor distT="0" distB="0" distL="114300" distR="114300" simplePos="0" relativeHeight="251702272" behindDoc="0" locked="0" layoutInCell="1" allowOverlap="1" wp14:anchorId="6700EFA6" wp14:editId="29F69E61">
+              <wp:anchor distT="0" distB="0" distL="114300" distR="114300" simplePos="0" relativeHeight="251659776" behindDoc="0" locked="0" layoutInCell="1" allowOverlap="1" wp14:anchorId="6CB6EFE5" wp14:editId="411E0958">
                 <wp:simplePos x="0" y="0"/>
                 <wp:positionH relativeFrom="column">
                   <wp:posOffset>2814971</wp:posOffset>
@@ -4414,7 +4702,7 @@
           </mc:Choice>
           <mc:Fallback>
             <w:pict>
-              <v:roundrect w14:anchorId="6700EFA6" id="Rectángulo redondeado 30" o:spid="_x0000_s1033" style="position:absolute;margin-left:221.65pt;margin-top:12.6pt;width:50.5pt;height:91.65pt;z-index:251702272;visibility:visible;mso-wrap-style:square;mso-wrap-distance-left:9pt;mso-wrap-distance-top:0;mso-wrap-distance-right:9pt;mso-wrap-distance-bottom:0;mso-position-horizontal:absolute;mso-position-horizontal-relative:text;mso-position-vertical:absolute;mso-position-vertical-relative:text;v-text-anchor:middle" arcsize="10923f" o:gfxdata="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" fillcolor="#f3f4f6 [3209]" strokecolor="#68738b [1609]" strokeweight="1pt">
+              <v:roundrect w14:anchorId="6CB6EFE5" id="Rectángulo redondeado 30" o:spid="_x0000_s1033" style="position:absolute;margin-left:221.65pt;margin-top:12.6pt;width:50.5pt;height:91.65pt;z-index:251659776;visibility:visible;mso-wrap-style:square;mso-wrap-distance-left:9pt;mso-wrap-distance-top:0;mso-wrap-distance-right:9pt;mso-wrap-distance-bottom:0;mso-position-horizontal:absolute;mso-position-horizontal-relative:text;mso-position-vertical:absolute;mso-position-vertical-relative:text;v-text-anchor:middle" arcsize="10923f" o:gfxdata="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" fillcolor="#f3f4f6 [3209]" strokecolor="#68738b [1609]" strokeweight="1pt">
                 <v:fill opacity="47288f"/>
                 <v:stroke joinstyle="miter"/>
                 <v:textbox>
@@ -4498,7 +4786,7 @@
         <mc:AlternateContent>
           <mc:Choice Requires="wps">
             <w:drawing>
-              <wp:anchor distT="0" distB="0" distL="114300" distR="114300" simplePos="0" relativeHeight="251702272" behindDoc="0" locked="0" layoutInCell="1" allowOverlap="1" wp14:anchorId="7526B85E" wp14:editId="697BD2C6">
+              <wp:anchor distT="0" distB="0" distL="114300" distR="114300" simplePos="0" relativeHeight="251660800" behindDoc="0" locked="0" layoutInCell="1" allowOverlap="1" wp14:anchorId="38595733" wp14:editId="56731E63">
                 <wp:simplePos x="0" y="0"/>
                 <wp:positionH relativeFrom="column">
                   <wp:posOffset>3711559</wp:posOffset>
@@ -4578,18 +4866,7 @@
                                 <w:szCs w:val="12"/>
                                 <w:lang w:eastAsia="es-ES"/>
                               </w:rPr>
-                              <w:t>Lujo, Realeza, Sabiduría y Poder</w:t>
-                            </w:r>
-                            <w:r>
-                              <w:rPr>
-                                <w:rFonts w:asciiTheme="majorHAnsi" w:eastAsia="Times New Roman" w:hAnsiTheme="majorHAnsi" w:cstheme="majorHAnsi"/>
-                                <w:b/>
-                                <w:bCs/>
-                                <w:sz w:val="12"/>
-                                <w:szCs w:val="12"/>
-                                <w:lang w:eastAsia="es-ES"/>
-                              </w:rPr>
-                              <w:t>.</w:t>
+                              <w:t>Lujo, Realeza, Sabiduría y Poder.</w:t>
                             </w:r>
                           </w:p>
                           <w:p>
@@ -4629,7 +4906,7 @@
           </mc:Choice>
           <mc:Fallback>
             <w:pict>
-              <v:roundrect w14:anchorId="7526B85E" id="Rectángulo redondeado 31" o:spid="_x0000_s1034" style="position:absolute;margin-left:292.25pt;margin-top:12.6pt;width:50.5pt;height:91.65pt;z-index:251702272;visibility:visible;mso-wrap-style:square;mso-wrap-distance-left:9pt;mso-wrap-distance-top:0;mso-wrap-distance-right:9pt;mso-wrap-distance-bottom:0;mso-position-horizontal:absolute;mso-position-horizontal-relative:text;mso-position-vertical:absolute;mso-position-vertical-relative:text;v-text-anchor:middle" arcsize="10923f" o:gfxdata="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" fillcolor="#f3f4f6 [3209]" strokecolor="#68738b [1609]" strokeweight="1pt">
+              <v:roundrect w14:anchorId="38595733" id="Rectángulo redondeado 31" o:spid="_x0000_s1034" style="position:absolute;margin-left:292.25pt;margin-top:12.6pt;width:50.5pt;height:91.65pt;z-index:251660800;visibility:visible;mso-wrap-style:square;mso-wrap-distance-left:9pt;mso-wrap-distance-top:0;mso-wrap-distance-right:9pt;mso-wrap-distance-bottom:0;mso-position-horizontal:absolute;mso-position-horizontal-relative:text;mso-position-vertical:absolute;mso-position-vertical-relative:text;v-text-anchor:middle" arcsize="10923f" o:gfxdata="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" fillcolor="#f3f4f6 [3209]" strokecolor="#68738b [1609]" strokeweight="1pt">
                 <v:fill opacity="47288f"/>
                 <v:stroke joinstyle="miter"/>
                 <v:textbox>
@@ -4665,18 +4942,7 @@
                           <w:szCs w:val="12"/>
                           <w:lang w:eastAsia="es-ES"/>
                         </w:rPr>
-                        <w:t>Lujo, Realeza, Sabiduría y Poder</w:t>
-                      </w:r>
-                      <w:r>
-                        <w:rPr>
-                          <w:rFonts w:asciiTheme="majorHAnsi" w:eastAsia="Times New Roman" w:hAnsiTheme="majorHAnsi" w:cstheme="majorHAnsi"/>
-                          <w:b/>
-                          <w:bCs/>
-                          <w:sz w:val="12"/>
-                          <w:szCs w:val="12"/>
-                          <w:lang w:eastAsia="es-ES"/>
-                        </w:rPr>
-                        <w:t>.</w:t>
+                        <w:t>Lujo, Realeza, Sabiduría y Poder.</w:t>
                       </w:r>
                     </w:p>
                     <w:p>
@@ -4724,7 +4990,7 @@
           <w:color w:val="000000" w:themeColor="text1"/>
         </w:rPr>
       </w:pPr>
-      <w:bookmarkStart w:id="6" w:name="_Toc240994410"/>
+      <w:bookmarkStart w:id="8" w:name="_Toc241167424"/>
       <w:r>
         <w:rPr>
           <w:b/>
@@ -4740,14 +5006,18 @@
         </w:rPr>
         <w:t>:</w:t>
       </w:r>
-      <w:bookmarkEnd w:id="6"/>
+      <w:bookmarkEnd w:id="8"/>
     </w:p>
     <w:p>
       <w:r>
+        <w:rPr>
+          <w:noProof/>
+          <w:lang w:eastAsia="es-ES"/>
+        </w:rPr>
         <mc:AlternateContent>
           <mc:Choice Requires="wps">
             <w:drawing>
-              <wp:anchor distT="45720" distB="45720" distL="114300" distR="114300" simplePos="0" relativeHeight="251719680" behindDoc="0" locked="0" layoutInCell="1" allowOverlap="1" wp14:anchorId="4E51F409" wp14:editId="390BCBA5">
+              <wp:anchor distT="45720" distB="45720" distL="114300" distR="114300" simplePos="0" relativeHeight="251673088" behindDoc="0" locked="0" layoutInCell="1" allowOverlap="1" wp14:anchorId="19619428" wp14:editId="4F7D945A">
                 <wp:simplePos x="0" y="0"/>
                 <wp:positionH relativeFrom="column">
                   <wp:posOffset>2753360</wp:posOffset>
@@ -4844,7 +5114,7 @@
           </mc:Choice>
           <mc:Fallback>
             <w:pict>
-              <v:shape w14:anchorId="4E51F409" id="_x0000_s1035" type="#_x0000_t202" style="position:absolute;margin-left:216.8pt;margin-top:19.05pt;width:59.75pt;height:53.75pt;z-index:251719680;visibility:visible;mso-wrap-style:square;mso-width-percent:0;mso-height-percent:0;mso-wrap-distance-left:9pt;mso-wrap-distance-top:3.6pt;mso-wrap-distance-right:9pt;mso-wrap-distance-bottom:3.6pt;mso-position-horizontal:absolute;mso-position-horizontal-relative:text;mso-position-vertical:absolute;mso-position-vertical-relative:text;mso-width-percent:0;mso-height-percent:0;mso-width-relative:margin;mso-height-relative:margin;v-text-anchor:top" o:gfxdata="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">
+              <v:shape w14:anchorId="19619428" id="_x0000_s1035" type="#_x0000_t202" style="position:absolute;margin-left:216.8pt;margin-top:19.05pt;width:59.75pt;height:53.75pt;z-index:251673088;visibility:visible;mso-wrap-style:square;mso-width-percent:0;mso-height-percent:0;mso-wrap-distance-left:9pt;mso-wrap-distance-top:3.6pt;mso-wrap-distance-right:9pt;mso-wrap-distance-bottom:3.6pt;mso-position-horizontal:absolute;mso-position-horizontal-relative:text;mso-position-vertical:absolute;mso-position-vertical-relative:text;mso-width-percent:0;mso-height-percent:0;mso-width-relative:margin;mso-height-relative:margin;v-text-anchor:top" o:gfxdata="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">
                 <v:textbox>
                   <w:txbxContent>
                     <w:p>
@@ -4891,10 +5161,14 @@
         </mc:AlternateContent>
       </w:r>
       <w:r>
+        <w:rPr>
+          <w:noProof/>
+          <w:lang w:eastAsia="es-ES"/>
+        </w:rPr>
         <mc:AlternateContent>
           <mc:Choice Requires="wps">
             <w:drawing>
-              <wp:anchor distT="45720" distB="45720" distL="114300" distR="114300" simplePos="0" relativeHeight="251718656" behindDoc="0" locked="0" layoutInCell="1" allowOverlap="1" wp14:anchorId="149052A2" wp14:editId="7FBED495">
+              <wp:anchor distT="45720" distB="45720" distL="114300" distR="114300" simplePos="0" relativeHeight="251672064" behindDoc="0" locked="0" layoutInCell="1" allowOverlap="1" wp14:anchorId="1FB12806" wp14:editId="6A593429">
                 <wp:simplePos x="0" y="0"/>
                 <wp:positionH relativeFrom="column">
                   <wp:posOffset>1874297</wp:posOffset>
@@ -4993,7 +5267,7 @@
           </mc:Choice>
           <mc:Fallback>
             <w:pict>
-              <v:shape w14:anchorId="149052A2" id="_x0000_s1036" type="#_x0000_t202" style="position:absolute;margin-left:147.6pt;margin-top:18.55pt;width:59.75pt;height:53.75pt;z-index:251718656;visibility:visible;mso-wrap-style:square;mso-width-percent:0;mso-height-percent:0;mso-wrap-distance-left:9pt;mso-wrap-distance-top:3.6pt;mso-wrap-distance-right:9pt;mso-wrap-distance-bottom:3.6pt;mso-position-horizontal:absolute;mso-position-horizontal-relative:text;mso-position-vertical:absolute;mso-position-vertical-relative:text;mso-width-percent:0;mso-height-percent:0;mso-width-relative:margin;mso-height-relative:margin;v-text-anchor:top" o:gfxdata="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">
+              <v:shape w14:anchorId="1FB12806" id="_x0000_s1036" type="#_x0000_t202" style="position:absolute;margin-left:147.6pt;margin-top:18.55pt;width:59.75pt;height:53.75pt;z-index:251672064;visibility:visible;mso-wrap-style:square;mso-width-percent:0;mso-height-percent:0;mso-wrap-distance-left:9pt;mso-wrap-distance-top:3.6pt;mso-wrap-distance-right:9pt;mso-wrap-distance-bottom:3.6pt;mso-position-horizontal:absolute;mso-position-horizontal-relative:text;mso-position-vertical:absolute;mso-position-vertical-relative:text;mso-width-percent:0;mso-height-percent:0;mso-width-relative:margin;mso-height-relative:margin;v-text-anchor:top" o:gfxdata="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">
                 <v:textbox>
                   <w:txbxContent>
                     <w:p>
@@ -5044,10 +5318,14 @@
     </w:p>
     <w:p>
       <w:r>
+        <w:rPr>
+          <w:noProof/>
+          <w:lang w:eastAsia="es-ES"/>
+        </w:rPr>
         <mc:AlternateContent>
           <mc:Choice Requires="wps">
             <w:drawing>
-              <wp:anchor distT="0" distB="0" distL="114300" distR="114300" simplePos="0" relativeHeight="251712512" behindDoc="0" locked="0" layoutInCell="1" allowOverlap="1" wp14:anchorId="56EE601F" wp14:editId="11EA792E">
+              <wp:anchor distT="0" distB="0" distL="114300" distR="114300" simplePos="0" relativeHeight="251665920" behindDoc="0" locked="0" layoutInCell="1" allowOverlap="1" wp14:anchorId="7B32FBC2" wp14:editId="6DF12CC5">
                 <wp:simplePos x="0" y="0"/>
                 <wp:positionH relativeFrom="column">
                   <wp:posOffset>1864360</wp:posOffset>
@@ -5120,10 +5398,14 @@
         </mc:AlternateContent>
       </w:r>
       <w:r>
+        <w:rPr>
+          <w:noProof/>
+          <w:lang w:eastAsia="es-ES"/>
+        </w:rPr>
         <mc:AlternateContent>
           <mc:Choice Requires="wps">
             <w:drawing>
-              <wp:anchor distT="0" distB="0" distL="114300" distR="114300" simplePos="0" relativeHeight="251713536" behindDoc="0" locked="0" layoutInCell="1" allowOverlap="1" wp14:anchorId="6B378D1C" wp14:editId="4D2D5C3D">
+              <wp:anchor distT="0" distB="0" distL="114300" distR="114300" simplePos="0" relativeHeight="251666944" behindDoc="0" locked="0" layoutInCell="1" allowOverlap="1" wp14:anchorId="584F85F7" wp14:editId="7DD32D11">
                 <wp:simplePos x="0" y="0"/>
                 <wp:positionH relativeFrom="column">
                   <wp:posOffset>2737485</wp:posOffset>
@@ -5194,10 +5476,14 @@
         </mc:AlternateContent>
       </w:r>
       <w:r>
+        <w:rPr>
+          <w:noProof/>
+          <w:lang w:eastAsia="es-ES"/>
+        </w:rPr>
         <mc:AlternateContent>
           <mc:Choice Requires="wps">
             <w:drawing>
-              <wp:anchor distT="0" distB="0" distL="114300" distR="114300" simplePos="0" relativeHeight="251714560" behindDoc="0" locked="0" layoutInCell="1" allowOverlap="1" wp14:anchorId="60386DBE" wp14:editId="6FD70D34">
+              <wp:anchor distT="0" distB="0" distL="114300" distR="114300" simplePos="0" relativeHeight="251667968" behindDoc="0" locked="0" layoutInCell="1" allowOverlap="1" wp14:anchorId="2974EB4D" wp14:editId="0573A1D9">
                 <wp:simplePos x="0" y="0"/>
                 <wp:positionH relativeFrom="column">
                   <wp:posOffset>1870710</wp:posOffset>
@@ -5259,10 +5545,14 @@
         </mc:AlternateContent>
       </w:r>
       <w:r>
+        <w:rPr>
+          <w:noProof/>
+          <w:lang w:eastAsia="es-ES"/>
+        </w:rPr>
         <mc:AlternateContent>
           <mc:Choice Requires="wps">
             <w:drawing>
-              <wp:anchor distT="0" distB="0" distL="114300" distR="114300" simplePos="0" relativeHeight="251715584" behindDoc="0" locked="0" layoutInCell="1" allowOverlap="1" wp14:anchorId="28227569" wp14:editId="4CFEF7D0">
+              <wp:anchor distT="0" distB="0" distL="114300" distR="114300" simplePos="0" relativeHeight="251668992" behindDoc="0" locked="0" layoutInCell="1" allowOverlap="1" wp14:anchorId="4014B023" wp14:editId="74B6124B">
                 <wp:simplePos x="0" y="0"/>
                 <wp:positionH relativeFrom="column">
                   <wp:posOffset>2737485</wp:posOffset>
@@ -5324,10 +5614,14 @@
         </mc:AlternateContent>
       </w:r>
       <w:r>
+        <w:rPr>
+          <w:noProof/>
+          <w:lang w:eastAsia="es-ES"/>
+        </w:rPr>
         <mc:AlternateContent>
           <mc:Choice Requires="wps">
             <w:drawing>
-              <wp:anchor distT="0" distB="0" distL="114300" distR="114300" simplePos="0" relativeHeight="251716608" behindDoc="0" locked="0" layoutInCell="1" allowOverlap="1" wp14:anchorId="6C75C904" wp14:editId="7DAD9237">
+              <wp:anchor distT="0" distB="0" distL="114300" distR="114300" simplePos="0" relativeHeight="251670016" behindDoc="0" locked="0" layoutInCell="1" allowOverlap="1" wp14:anchorId="07E8B073" wp14:editId="04C5E028">
                 <wp:simplePos x="0" y="0"/>
                 <wp:positionH relativeFrom="column">
                   <wp:posOffset>1924050</wp:posOffset>
@@ -5477,7 +5771,7 @@
           </mc:Choice>
           <mc:Fallback>
             <w:pict>
-              <v:roundrect w14:anchorId="6C75C904" id="Rectángulo redondeado 209" o:spid="_x0000_s1037" style="position:absolute;margin-left:151.5pt;margin-top:138.65pt;width:50.45pt;height:91.6pt;z-index:251716608;visibility:visible;mso-wrap-style:square;mso-wrap-distance-left:9pt;mso-wrap-distance-top:0;mso-wrap-distance-right:9pt;mso-wrap-distance-bottom:0;mso-position-horizontal:absolute;mso-position-horizontal-relative:text;mso-position-vertical:absolute;mso-position-vertical-relative:text;v-text-anchor:middle" arcsize="10923f" o:gfxdata="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" fillcolor="#f3f4f6 [3209]" strokecolor="#68738b [1609]" strokeweight="1pt">
+              <v:roundrect w14:anchorId="07E8B073" id="Rectángulo redondeado 209" o:spid="_x0000_s1037" style="position:absolute;margin-left:151.5pt;margin-top:138.65pt;width:50.45pt;height:91.6pt;z-index:251670016;visibility:visible;mso-wrap-style:square;mso-wrap-distance-left:9pt;mso-wrap-distance-top:0;mso-wrap-distance-right:9pt;mso-wrap-distance-bottom:0;mso-position-horizontal:absolute;mso-position-horizontal-relative:text;mso-position-vertical:absolute;mso-position-vertical-relative:text;v-text-anchor:middle" arcsize="10923f" o:gfxdata="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" fillcolor="#f3f4f6 [3209]" strokecolor="#68738b [1609]" strokeweight="1pt">
                 <v:fill opacity="47288f"/>
                 <v:stroke joinstyle="miter"/>
                 <v:textbox>
@@ -5575,10 +5869,14 @@
         </mc:AlternateContent>
       </w:r>
       <w:r>
+        <w:rPr>
+          <w:noProof/>
+          <w:lang w:eastAsia="es-ES"/>
+        </w:rPr>
         <mc:AlternateContent>
           <mc:Choice Requires="wps">
             <w:drawing>
-              <wp:anchor distT="0" distB="0" distL="114300" distR="114300" simplePos="0" relativeHeight="251717632" behindDoc="0" locked="0" layoutInCell="1" allowOverlap="1" wp14:anchorId="06CF3A40" wp14:editId="56FA5CE0">
+              <wp:anchor distT="0" distB="0" distL="114300" distR="114300" simplePos="0" relativeHeight="251671040" behindDoc="0" locked="0" layoutInCell="1" allowOverlap="1" wp14:anchorId="363510BC" wp14:editId="2CCFCA99">
                 <wp:simplePos x="0" y="0"/>
                 <wp:positionH relativeFrom="column">
                   <wp:posOffset>2779395</wp:posOffset>
@@ -5718,7 +6016,7 @@
           </mc:Choice>
           <mc:Fallback>
             <w:pict>
-              <v:roundrect w14:anchorId="06CF3A40" id="Rectángulo redondeado 210" o:spid="_x0000_s1038" style="position:absolute;margin-left:218.85pt;margin-top:138.65pt;width:50.45pt;height:91.6pt;z-index:251717632;visibility:visible;mso-wrap-style:square;mso-wrap-distance-left:9pt;mso-wrap-distance-top:0;mso-wrap-distance-right:9pt;mso-wrap-distance-bottom:0;mso-position-horizontal:absolute;mso-position-horizontal-relative:text;mso-position-vertical:absolute;mso-position-vertical-relative:text;v-text-anchor:middle" arcsize="10923f" o:gfxdata="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" fillcolor="#f3f4f6 [3209]" strokecolor="#68738b [1609]" strokeweight="1pt">
+              <v:roundrect w14:anchorId="363510BC" id="Rectángulo redondeado 210" o:spid="_x0000_s1038" style="position:absolute;margin-left:218.85pt;margin-top:138.65pt;width:50.45pt;height:91.6pt;z-index:251671040;visibility:visible;mso-wrap-style:square;mso-wrap-distance-left:9pt;mso-wrap-distance-top:0;mso-wrap-distance-right:9pt;mso-wrap-distance-bottom:0;mso-position-horizontal:absolute;mso-position-horizontal-relative:text;mso-position-vertical:absolute;mso-position-vertical-relative:text;v-text-anchor:middle" arcsize="10923f" o:gfxdata="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" fillcolor="#f3f4f6 [3209]" strokecolor="#68738b [1609]" strokeweight="1pt">
                 <v:fill opacity="47288f"/>
                 <v:stroke joinstyle="miter"/>
                 <v:textbox>
@@ -5830,29 +6128,22 @@
           <w:color w:val="000000" w:themeColor="text1"/>
         </w:rPr>
       </w:pPr>
-      <w:bookmarkStart w:id="7" w:name="_Toc240994411"/>
+      <w:bookmarkStart w:id="9" w:name="_Toc241167425"/>
       <w:r>
         <w:rPr>
           <w:b/>
           <w:color w:val="000000" w:themeColor="text1"/>
         </w:rPr>
-        <w:t>COMPLEMENT</w:t>
+        <w:t>COMPLEMENTARIOS</w:t>
       </w:r>
       <w:r>
         <w:rPr>
           <w:b/>
           <w:color w:val="000000" w:themeColor="text1"/>
         </w:rPr>
-        <w:t>ARIOS</w:t>
-      </w:r>
-      <w:r>
-        <w:rPr>
-          <w:b/>
-          <w:color w:val="000000" w:themeColor="text1"/>
-        </w:rPr>
         <w:t>:</w:t>
       </w:r>
-      <w:bookmarkEnd w:id="7"/>
+      <w:bookmarkEnd w:id="9"/>
     </w:p>
     <w:p>
       <w:pPr>
@@ -5880,8 +6171,6 @@
       <w:r>
         <w:t xml:space="preserve"> Mis colores son fríos y estos son completamente cálidos.</w:t>
       </w:r>
-      <w:bookmarkStart w:id="8" w:name="_GoBack"/>
-      <w:bookmarkEnd w:id="8"/>
     </w:p>
     <w:p/>
     <w:p>
@@ -5891,7 +6180,7 @@
           <w:lang w:eastAsia="es-ES"/>
         </w:rPr>
         <w:drawing>
-          <wp:anchor distT="0" distB="0" distL="114300" distR="114300" simplePos="0" relativeHeight="251720704" behindDoc="0" locked="0" layoutInCell="1" allowOverlap="1" wp14:anchorId="5F972232" wp14:editId="4407C81B">
+          <wp:anchor distT="0" distB="0" distL="114300" distR="114300" simplePos="0" relativeHeight="251674112" behindDoc="0" locked="0" layoutInCell="1" allowOverlap="1" wp14:anchorId="5F972232" wp14:editId="4407C81B">
             <wp:simplePos x="0" y="0"/>
             <wp:positionH relativeFrom="margin">
               <wp:posOffset>1532981</wp:posOffset>
@@ -5914,7 +6203,7 @@
                     <pic:cNvPicPr/>
                   </pic:nvPicPr>
                   <pic:blipFill rotWithShape="1">
-                    <a:blip r:embed="rId16">
+                    <a:blip r:embed="rId15">
                       <a:extLst>
                         <a:ext uri="{28A0092B-C50C-407E-A947-70E740481C1C}">
                           <a14:useLocalDpi xmlns:a14="http://schemas.microsoft.com/office/drawing/2010/main" val="0"/>
@@ -6089,7 +6378,7 @@
       </w:pPr>
     </w:p>
     <w:sectPr>
-      <w:footerReference w:type="default" r:id="rId17"/>
+      <w:footerReference w:type="default" r:id="rId16"/>
       <w:pgSz w:w="11906" w:h="16838"/>
       <w:pgMar w:top="1417" w:right="1701" w:bottom="1417" w:left="1701" w:header="708" w:footer="708" w:gutter="0"/>
       <w:cols w:space="708"/>
@@ -6134,6 +6423,7 @@
         <w:docPartUnique/>
       </w:docPartObj>
     </w:sdtPr>
+    <w:sdtEndPr/>
     <w:sdtContent>
       <w:p>
         <w:pPr>
@@ -6266,7 +6556,7 @@
                                     <w:sz w:val="16"/>
                                     <w:szCs w:val="16"/>
                                   </w:rPr>
-                                  <w:t>7</w:t>
+                                  <w:t>3</w:t>
                                 </w:r>
                                 <w:r>
                                   <w:rPr>
@@ -6329,7 +6619,7 @@
                               <w:sz w:val="16"/>
                               <w:szCs w:val="16"/>
                             </w:rPr>
-                            <w:t>7</w:t>
+                            <w:t>3</w:t>
                           </w:r>
                           <w:r>
                             <w:rPr>
@@ -6383,7 +6673,7 @@
 <w:numbering xmlns:wpc="http://schemas.microsoft.com/office/word/2010/wordprocessingCanvas" xmlns:cx="http://schemas.microsoft.com/office/drawing/2014/chartex" xmlns:mc="http://schemas.openxmlformats.org/markup-compatibility/2006" xmlns:o="urn:schemas-microsoft-com:office:office" xmlns:r="http://schemas.openxmlformats.org/officeDocument/2006/relationships" xmlns:m="http://schemas.openxmlformats.org/officeDocument/2006/math" xmlns:v="urn:schemas-microsoft-com:vml" xmlns:wp14="http://schemas.microsoft.com/office/word/2010/wordprocessingDrawing" xmlns:wp="http://schemas.openxmlformats.org/drawingml/2006/wordprocessingDrawing" xmlns:w10="urn:schemas-microsoft-com:office:word" xmlns:w="http://schemas.openxmlformats.org/wordprocessingml/2006/main" xmlns:w14="http://schemas.microsoft.com/office/word/2010/wordml" xmlns:w15="http://schemas.microsoft.com/office/word/2012/wordml" xmlns:w16se="http://schemas.microsoft.com/office/word/2015/wordml/symex" xmlns:wpg="http://schemas.microsoft.com/office/word/2010/wordprocessingGroup" xmlns:wpi="http://schemas.microsoft.com/office/word/2010/wordprocessingInk" xmlns:wne="http://schemas.microsoft.com/office/word/2006/wordml" xmlns:wps="http://schemas.microsoft.com/office/word/2010/wordprocessingShape" mc:Ignorable="w14 w15 w16se wp14">
   <w:numPicBullet w:numPicBulletId="0">
     <w:pict>
-      <v:shapetype id="_x0000_t75" coordsize="21600,21600" o:spt="75" o:preferrelative="t" path="m@4@5l@4@11@9@11@9@5xe" filled="f" stroked="f">
+      <v:shapetype w14:anchorId="370E91E4" id="_x0000_t75" coordsize="21600,21600" o:spt="75" o:preferrelative="t" path="m@4@5l@4@11@9@11@9@5xe" filled="f" stroked="f">
         <v:stroke joinstyle="miter"/>
         <v:formulas>
           <v:f eqn="if lineDrawn pixelLineWidth 0"/>
@@ -6402,7 +6692,7 @@
         <v:path o:extrusionok="f" gradientshapeok="t" o:connecttype="rect"/>
         <o:lock v:ext="edit" aspectratio="t"/>
       </v:shapetype>
-      <v:shape id="_x0000_i1082" type="#_x0000_t75" style="width:80.9pt;height:90.7pt" o:bullet="t">
+      <v:shape id="_x0000_i1043" type="#_x0000_t75" style="width:80.65pt;height:90.45pt" o:bullet="t">
         <v:imagedata r:id="rId1" o:title="ISOTIPO_NEBULA"/>
       </v:shape>
     </w:pict>
@@ -7165,6 +7455,155 @@
     </w:lvl>
   </w:abstractNum>
   <w:abstractNum w:abstractNumId="6" w15:restartNumberingAfterBreak="0">
+    <w:nsid w:val="4DE63770"/>
+    <w:multiLevelType w:val="multilevel"/>
+    <w:tmpl w:val="1C94D920"/>
+    <w:lvl w:ilvl="0">
+      <w:start w:val="1"/>
+      <w:numFmt w:val="bullet"/>
+      <w:lvlText w:val=""/>
+      <w:lvlJc w:val="left"/>
+      <w:pPr>
+        <w:tabs>
+          <w:tab w:val="num" w:pos="720"/>
+        </w:tabs>
+        <w:ind w:left="720" w:hanging="360"/>
+      </w:pPr>
+      <w:rPr>
+        <w:rFonts w:ascii="Symbol" w:hAnsi="Symbol" w:hint="default"/>
+        <w:sz w:val="20"/>
+      </w:rPr>
+    </w:lvl>
+    <w:lvl w:ilvl="1" w:tentative="1">
+      <w:start w:val="1"/>
+      <w:numFmt w:val="bullet"/>
+      <w:lvlText w:val="o"/>
+      <w:lvlJc w:val="left"/>
+      <w:pPr>
+        <w:tabs>
+          <w:tab w:val="num" w:pos="1440"/>
+        </w:tabs>
+        <w:ind w:left="1440" w:hanging="360"/>
+      </w:pPr>
+      <w:rPr>
+        <w:rFonts w:ascii="Courier New" w:hAnsi="Courier New" w:hint="default"/>
+        <w:sz w:val="20"/>
+      </w:rPr>
+    </w:lvl>
+    <w:lvl w:ilvl="2" w:tentative="1">
+      <w:start w:val="1"/>
+      <w:numFmt w:val="bullet"/>
+      <w:lvlText w:val=""/>
+      <w:lvlJc w:val="left"/>
+      <w:pPr>
+        <w:tabs>
+          <w:tab w:val="num" w:pos="2160"/>
+        </w:tabs>
+        <w:ind w:left="2160" w:hanging="360"/>
+      </w:pPr>
+      <w:rPr>
+        <w:rFonts w:ascii="Wingdings" w:hAnsi="Wingdings" w:hint="default"/>
+        <w:sz w:val="20"/>
+      </w:rPr>
+    </w:lvl>
+    <w:lvl w:ilvl="3" w:tentative="1">
+      <w:start w:val="1"/>
+      <w:numFmt w:val="bullet"/>
+      <w:lvlText w:val=""/>
+      <w:lvlJc w:val="left"/>
+      <w:pPr>
+        <w:tabs>
+          <w:tab w:val="num" w:pos="2880"/>
+        </w:tabs>
+        <w:ind w:left="2880" w:hanging="360"/>
+      </w:pPr>
+      <w:rPr>
+        <w:rFonts w:ascii="Wingdings" w:hAnsi="Wingdings" w:hint="default"/>
+        <w:sz w:val="20"/>
+      </w:rPr>
+    </w:lvl>
+    <w:lvl w:ilvl="4" w:tentative="1">
+      <w:start w:val="1"/>
+      <w:numFmt w:val="bullet"/>
+      <w:lvlText w:val=""/>
+      <w:lvlJc w:val="left"/>
+      <w:pPr>
+        <w:tabs>
+          <w:tab w:val="num" w:pos="3600"/>
+        </w:tabs>
+        <w:ind w:left="3600" w:hanging="360"/>
+      </w:pPr>
+      <w:rPr>
+        <w:rFonts w:ascii="Wingdings" w:hAnsi="Wingdings" w:hint="default"/>
+        <w:sz w:val="20"/>
+      </w:rPr>
+    </w:lvl>
+    <w:lvl w:ilvl="5" w:tentative="1">
+      <w:start w:val="1"/>
+      <w:numFmt w:val="bullet"/>
+      <w:lvlText w:val=""/>
+      <w:lvlJc w:val="left"/>
+      <w:pPr>
+        <w:tabs>
+          <w:tab w:val="num" w:pos="4320"/>
+        </w:tabs>
+        <w:ind w:left="4320" w:hanging="360"/>
+      </w:pPr>
+      <w:rPr>
+        <w:rFonts w:ascii="Wingdings" w:hAnsi="Wingdings" w:hint="default"/>
+        <w:sz w:val="20"/>
+      </w:rPr>
+    </w:lvl>
+    <w:lvl w:ilvl="6" w:tentative="1">
+      <w:start w:val="1"/>
+      <w:numFmt w:val="bullet"/>
+      <w:lvlText w:val=""/>
+      <w:lvlJc w:val="left"/>
+      <w:pPr>
+        <w:tabs>
+          <w:tab w:val="num" w:pos="5040"/>
+        </w:tabs>
+        <w:ind w:left="5040" w:hanging="360"/>
+      </w:pPr>
+      <w:rPr>
+        <w:rFonts w:ascii="Wingdings" w:hAnsi="Wingdings" w:hint="default"/>
+        <w:sz w:val="20"/>
+      </w:rPr>
+    </w:lvl>
+    <w:lvl w:ilvl="7" w:tentative="1">
+      <w:start w:val="1"/>
+      <w:numFmt w:val="bullet"/>
+      <w:lvlText w:val=""/>
+      <w:lvlJc w:val="left"/>
+      <w:pPr>
+        <w:tabs>
+          <w:tab w:val="num" w:pos="5760"/>
+        </w:tabs>
+        <w:ind w:left="5760" w:hanging="360"/>
+      </w:pPr>
+      <w:rPr>
+        <w:rFonts w:ascii="Wingdings" w:hAnsi="Wingdings" w:hint="default"/>
+        <w:sz w:val="20"/>
+      </w:rPr>
+    </w:lvl>
+    <w:lvl w:ilvl="8" w:tentative="1">
+      <w:start w:val="1"/>
+      <w:numFmt w:val="bullet"/>
+      <w:lvlText w:val=""/>
+      <w:lvlJc w:val="left"/>
+      <w:pPr>
+        <w:tabs>
+          <w:tab w:val="num" w:pos="6480"/>
+        </w:tabs>
+        <w:ind w:left="6480" w:hanging="360"/>
+      </w:pPr>
+      <w:rPr>
+        <w:rFonts w:ascii="Wingdings" w:hAnsi="Wingdings" w:hint="default"/>
+        <w:sz w:val="20"/>
+      </w:rPr>
+    </w:lvl>
+  </w:abstractNum>
+  <w:abstractNum w:abstractNumId="7" w15:restartNumberingAfterBreak="0">
     <w:nsid w:val="665769E2"/>
     <w:multiLevelType w:val="multilevel"/>
     <w:tmpl w:val="AC9A233E"/>
@@ -7281,7 +7720,7 @@
       </w:pPr>
     </w:lvl>
   </w:abstractNum>
-  <w:abstractNum w:abstractNumId="7" w15:restartNumberingAfterBreak="0">
+  <w:abstractNum w:abstractNumId="8" w15:restartNumberingAfterBreak="0">
     <w:nsid w:val="6A813273"/>
     <w:multiLevelType w:val="multilevel"/>
     <w:tmpl w:val="3452A19A"/>
@@ -7430,7 +7869,7 @@
       </w:rPr>
     </w:lvl>
   </w:abstractNum>
-  <w:abstractNum w:abstractNumId="8" w15:restartNumberingAfterBreak="0">
+  <w:abstractNum w:abstractNumId="9" w15:restartNumberingAfterBreak="0">
     <w:nsid w:val="6C3D2E20"/>
     <w:multiLevelType w:val="multilevel"/>
     <w:tmpl w:val="75582B64"/>
@@ -7579,7 +8018,7 @@
       </w:rPr>
     </w:lvl>
   </w:abstractNum>
-  <w:abstractNum w:abstractNumId="9" w15:restartNumberingAfterBreak="0">
+  <w:abstractNum w:abstractNumId="10" w15:restartNumberingAfterBreak="0">
     <w:nsid w:val="71EA7BF6"/>
     <w:multiLevelType w:val="hybridMultilevel"/>
     <w:tmpl w:val="CD96810C"/>
@@ -7693,13 +8132,13 @@
     </w:lvl>
   </w:abstractNum>
   <w:num w:numId="1">
-    <w:abstractNumId w:val="7"/>
+    <w:abstractNumId w:val="8"/>
   </w:num>
   <w:num w:numId="2">
     <w:abstractNumId w:val="3"/>
   </w:num>
   <w:num w:numId="3">
-    <w:abstractNumId w:val="8"/>
+    <w:abstractNumId w:val="9"/>
   </w:num>
   <w:num w:numId="4">
     <w:abstractNumId w:val="2"/>
@@ -7708,7 +8147,7 @@
     <w:abstractNumId w:val="0"/>
   </w:num>
   <w:num w:numId="6">
-    <w:abstractNumId w:val="6"/>
+    <w:abstractNumId w:val="7"/>
   </w:num>
   <w:num w:numId="7">
     <w:abstractNumId w:val="4"/>
@@ -7720,7 +8159,10 @@
     <w:abstractNumId w:val="1"/>
   </w:num>
   <w:num w:numId="10">
-    <w:abstractNumId w:val="9"/>
+    <w:abstractNumId w:val="10"/>
+  </w:num>
+  <w:num w:numId="11">
+    <w:abstractNumId w:val="6"/>
   </w:num>
 </w:numbering>
 </file>
@@ -8162,6 +8604,29 @@
       <w:szCs w:val="26"/>
     </w:rPr>
   </w:style>
+  <w:style w:type="paragraph" w:styleId="Ttulo3">
+    <w:name w:val="heading 3"/>
+    <w:basedOn w:val="Normal"/>
+    <w:next w:val="Normal"/>
+    <w:link w:val="Ttulo3Car"/>
+    <w:uiPriority w:val="9"/>
+    <w:semiHidden/>
+    <w:unhideWhenUsed/>
+    <w:qFormat/>
+    <w:rsid w:val="006A717B"/>
+    <w:pPr>
+      <w:keepNext/>
+      <w:keepLines/>
+      <w:spacing w:before="40" w:after="0"/>
+      <w:outlineLvl w:val="2"/>
+    </w:pPr>
+    <w:rPr>
+      <w:rFonts w:asciiTheme="majorHAnsi" w:eastAsiaTheme="majorEastAsia" w:hAnsiTheme="majorHAnsi" w:cstheme="majorBidi"/>
+      <w:color w:val="040407" w:themeColor="accent1" w:themeShade="7F"/>
+      <w:sz w:val="24"/>
+      <w:szCs w:val="24"/>
+    </w:rPr>
+  </w:style>
   <w:style w:type="character" w:default="1" w:styleId="Fuentedeprrafopredeter">
     <w:name w:val="Default Paragraph Font"/>
     <w:uiPriority w:val="1"/>
@@ -8358,6 +8823,20 @@
       <w:spacing w:after="100"/>
       <w:ind w:left="220"/>
     </w:pPr>
+  </w:style>
+  <w:style w:type="character" w:customStyle="1" w:styleId="Ttulo3Car">
+    <w:name w:val="Título 3 Car"/>
+    <w:basedOn w:val="Fuentedeprrafopredeter"/>
+    <w:link w:val="Ttulo3"/>
+    <w:uiPriority w:val="9"/>
+    <w:semiHidden/>
+    <w:rsid w:val="006A717B"/>
+    <w:rPr>
+      <w:rFonts w:asciiTheme="majorHAnsi" w:eastAsiaTheme="majorEastAsia" w:hAnsiTheme="majorHAnsi" w:cstheme="majorBidi"/>
+      <w:color w:val="040407" w:themeColor="accent1" w:themeShade="7F"/>
+      <w:sz w:val="24"/>
+      <w:szCs w:val="24"/>
+    </w:rPr>
   </w:style>
 </w:styles>
 </file>
@@ -8628,7 +9107,7 @@
 </file>
 
 <file path=customXml/itemProps1.xml><?xml version="1.0" encoding="utf-8"?>
-<ds:datastoreItem xmlns:ds="http://schemas.openxmlformats.org/officeDocument/2006/customXml" ds:itemID="{DC708A15-6AA8-430D-9199-E0868DCD0D18}">
+<ds:datastoreItem xmlns:ds="http://schemas.openxmlformats.org/officeDocument/2006/customXml" ds:itemID="{8E49FEFF-BE5C-4687-8B56-A0FC00687023}">
   <ds:schemaRefs>
     <ds:schemaRef ds:uri="http://schemas.openxmlformats.org/officeDocument/2006/bibliography"/>
   </ds:schemaRefs>

</xml_diff>